<commit_message>
feat(sit): Allocation & Berthing, Loading module, SI Approval/View, UI updates
- Allocation: phase stepper, vessel detail modal (ETA/TA/ETB/TB), Log Arrival Update, Confirm Berthing (jetty, TB, photos, validation), incoming vessel table with expanded row
- Rename Docking to Berthing; remove Docking.jsx; Allocation & Berthing in nav
- Loading: Pre-Checking (A1-A3), Loading tab (Detail Activity: category dropdown, description, start/end time, table with Edit/Delete), Post-Checking (C1-C2); LoadingContext for steps and activities
- Loading tab: Vessel & Cargo section, Detail Activity form and table (LOADING_ACTIVITY_CATEGORIES), add/update/delete activities
- SI: Approval and View pages; new styles (si-approval, si-view, berthing-allocation)
- Mock data: allocationPlan, loading operations, initialLoadingStepsByVesselId, initialLoadingOperationByVesselId, getLoadingOperationCargo
- No new npm dependencies; no env vars required for mockup

Made-with: Cursor
</commit_message>
<xml_diff>
--- a/Docs/Jetty PRD vRian - 0.1.docx
+++ b/Docs/Jetty PRD vRian - 0.1.docx
@@ -3,12 +3,18 @@
 <w:document xmlns:wpc="http://schemas.microsoft.com/office/word/2010/wordprocessingCanvas" xmlns:cx="http://schemas.microsoft.com/office/drawing/2014/chartex" xmlns:cx1="http://schemas.microsoft.com/office/drawing/2015/9/8/chartex" xmlns:cx2="http://schemas.microsoft.com/office/drawing/2015/10/21/chartex" xmlns:cx3="http://schemas.microsoft.com/office/drawing/2016/5/9/chartex" xmlns:cx4="http://schemas.microsoft.com/office/drawing/2016/5/10/chartex" xmlns:cx5="http://schemas.microsoft.com/office/drawing/2016/5/11/chartex" xmlns:cx6="http://schemas.microsoft.com/office/drawing/2016/5/12/chartex" xmlns:cx7="http://schemas.microsoft.com/office/drawing/2016/5/13/chartex" xmlns:cx8="http://schemas.microsoft.com/office/drawing/2016/5/14/chartex" xmlns:mc="http://schemas.openxmlformats.org/markup-compatibility/2006" xmlns:aink="http://schemas.microsoft.com/office/drawing/2016/ink" xmlns:am3d="http://schemas.microsoft.com/office/drawing/2017/model3d" xmlns:o="urn:schemas-microsoft-com:office:office" xmlns:oel="http://schemas.microsoft.com/office/2019/extlst" xmlns:r="http://schemas.openxmlformats.org/officeDocument/2006/relationships" xmlns:m="http://schemas.openxmlformats.org/officeDocument/2006/math" xmlns:v="urn:schemas-microsoft-com:vml" xmlns:wp14="http://schemas.microsoft.com/office/word/2010/wordprocessingDrawing" xmlns:wp="http://schemas.openxmlformats.org/drawingml/2006/wordprocessingDrawing" xmlns:w10="urn:schemas-microsoft-com:office:word" xmlns:w="http://schemas.openxmlformats.org/wordprocessingml/2006/main" xmlns:w14="http://schemas.microsoft.com/office/word/2010/wordml" xmlns:w15="http://schemas.microsoft.com/office/word/2012/wordml" xmlns:w16cex="http://schemas.microsoft.com/office/word/2018/wordml/cex" xmlns:w16cid="http://schemas.microsoft.com/office/word/2016/wordml/cid" xmlns:w16="http://schemas.microsoft.com/office/word/2018/wordml" xmlns:w16du="http://schemas.microsoft.com/office/word/2023/wordml/word16du" xmlns:w16sdtdh="http://schemas.microsoft.com/office/word/2020/wordml/sdtdatahash" xmlns:w16sdtfl="http://schemas.microsoft.com/office/word/2024/wordml/sdtformatlock" xmlns:w16se="http://schemas.microsoft.com/office/word/2015/wordml/symex" xmlns:wpg="http://schemas.microsoft.com/office/word/2010/wordprocessingGroup" xmlns:wpi="http://schemas.microsoft.com/office/word/2010/wordprocessingInk" xmlns:wne="http://schemas.microsoft.com/office/word/2006/wordml" xmlns:wps="http://schemas.microsoft.com/office/word/2010/wordprocessingShape" mc:Ignorable="w14 w15 w16se w16cid w16 w16cex w16sdtdh w16sdtfl w16du wp14">
   <w:body>
     <w:p>
+      <w:pPr>
+        <w:rPr>
+          <w:b/>
+          <w:bCs/>
+        </w:rPr>
+      </w:pPr>
       <w:r>
         <w:rPr>
           <w:b/>
           <w:bCs/>
         </w:rPr>
-        <w:t>Lean Product Requirements Document: Jetty Planning System (JPS)</w:t>
+        <w:t>Lean Product Requirements Document: Jetty Planning &amp; Monitoring System</w:t>
       </w:r>
     </w:p>
     <w:p>
@@ -17,20 +23,29 @@
           <w:b/>
           <w:bCs/>
         </w:rPr>
-        <w:t>Author:</w:t>
+        <w:t>Product Manager:</w:t>
       </w:r>
       <w:r>
-        <w:t xml:space="preserve"> Rian Dharmawan | </w:t>
+        <w:t xml:space="preserve"> Rian Dharmawan</w:t>
       </w:r>
+    </w:p>
+    <w:p>
       <w:r>
         <w:rPr>
           <w:b/>
           <w:bCs/>
         </w:rPr>
-        <w:t>Date:</w:t>
+        <w:t>Created Date:</w:t>
       </w:r>
       <w:r>
-        <w:t xml:space="preserve"> 2026-03-03</w:t>
+        <w:t xml:space="preserve"> 09 Mar 2026</w:t>
+      </w:r>
+    </w:p>
+    <w:p>
+      <w:r>
+        <w:pict w14:anchorId="00FD60E1">
+          <v:rect id="_x0000_i1025" style="width:0;height:1.5pt" o:hralign="center" o:hrstd="t" o:hrnoshade="t" o:hr="t" fillcolor="gray" stroked="f"/>
+        </w:pict>
       </w:r>
     </w:p>
     <w:p>
@@ -52,7 +67,7 @@
       <w:pPr>
         <w:numPr>
           <w:ilvl w:val="0"/>
-          <w:numId w:val="1"/>
+          <w:numId w:val="6"/>
         </w:numPr>
       </w:pPr>
       <w:r>
@@ -63,14 +78,14 @@
         <w:t>Vision / Goal:</w:t>
       </w:r>
       <w:r>
-        <w:t xml:space="preserve"> To digitize fragmented manual jetty operations into a unified system that eliminates financial leakage and provides real-time operational visibility.</w:t>
+        <w:t xml:space="preserve"> To digitize and streamline end-to-end jetty operations by providing real-time visibility, automated SLA calculations, and standardized workflows for vessel loading/unloading.</w:t>
       </w:r>
     </w:p>
     <w:p>
       <w:pPr>
         <w:numPr>
           <w:ilvl w:val="0"/>
-          <w:numId w:val="1"/>
+          <w:numId w:val="6"/>
         </w:numPr>
       </w:pPr>
       <w:r>
@@ -81,17 +96,7 @@
         <w:t>Target Users:</w:t>
       </w:r>
       <w:r>
-        <w:t xml:space="preserve"> </w:t>
-      </w:r>
-      <w:r>
-        <w:rPr>
-          <w:b/>
-          <w:bCs/>
-        </w:rPr>
-        <w:t>Management</w:t>
-      </w:r>
-      <w:r>
-        <w:t>, PPIC, Jetty Team, Tank Farm Team, and external partners (Agents/Surveyors).</w:t>
+        <w:t xml:space="preserve"> Jetty Operators, Logistics &amp; EXIM teams, Quality Control (QC), Tank Farm teams, and PPIC for monitoring.</w:t>
       </w:r>
     </w:p>
     <w:p>
@@ -111,17 +116,7 @@
     </w:p>
     <w:p>
       <w:r>
-        <w:t xml:space="preserve">The current reliance on Excel and WhatsApp for jetty management causes significant "blind spots" in the supply chain. Specifically, management lacks visibility into vessel nearness, resulting in extreme delays—such as the 8-day wait experienced by </w:t>
-      </w:r>
-      <w:r>
-        <w:rPr>
-          <w:b/>
-          <w:bCs/>
-        </w:rPr>
-        <w:t>BG Mulia VII</w:t>
-      </w:r>
-      <w:r>
-        <w:t>—and has no centralized way to audit SLAs or product loss/gain across shifts.</w:t>
+        <w:t>Jetty operations currently lack a centralized system for tracking vessel progress, leading to manual SLA calculations, fragmented communication between departments (QC, Tank Farm, Jetty), and potential demurrage costs due to inefficient planning.</w:t>
       </w:r>
     </w:p>
     <w:p>
@@ -143,7 +138,7 @@
       <w:pPr>
         <w:numPr>
           <w:ilvl w:val="0"/>
-          <w:numId w:val="2"/>
+          <w:numId w:val="7"/>
         </w:numPr>
       </w:pPr>
       <w:r>
@@ -151,17 +146,17 @@
           <w:b/>
           <w:bCs/>
         </w:rPr>
-        <w:t>Wait-Time Reduction:</w:t>
+        <w:t>SLA Accuracy:</w:t>
       </w:r>
       <w:r>
-        <w:t xml:space="preserve"> Decrease the average gap between vessel arrival at anchorage and actual berthing.</w:t>
+        <w:t xml:space="preserve"> Variance between system-calculated Estimated Completion and actual completion time.</w:t>
       </w:r>
     </w:p>
     <w:p>
       <w:pPr>
         <w:numPr>
           <w:ilvl w:val="0"/>
-          <w:numId w:val="2"/>
+          <w:numId w:val="7"/>
         </w:numPr>
       </w:pPr>
       <w:r>
@@ -169,17 +164,17 @@
           <w:b/>
           <w:bCs/>
         </w:rPr>
-        <w:t>Demurrage Cost Savings:</w:t>
+        <w:t>Demurrage Reduction:</w:t>
       </w:r>
       <w:r>
-        <w:t xml:space="preserve"> Lower monthly penalties paid to vessel owners by optimizing the jetty "Line-Up".</w:t>
+        <w:t xml:space="preserve"> Decrease in vessel wait times and idle jetty occupancy.</w:t>
       </w:r>
     </w:p>
     <w:p>
       <w:pPr>
         <w:numPr>
           <w:ilvl w:val="0"/>
-          <w:numId w:val="2"/>
+          <w:numId w:val="7"/>
         </w:numPr>
       </w:pPr>
       <w:r>
@@ -187,10 +182,17 @@
           <w:b/>
           <w:bCs/>
         </w:rPr>
-        <w:t>Data Accuracy:</w:t>
+        <w:t>Operational Visibility:</w:t>
       </w:r>
       <w:r>
-        <w:t xml:space="preserve"> Achieve 100% digital reconciliation of volume and quality data before a vessel is cleared to sail.</w:t>
+        <w:t xml:space="preserve"> 100% of vessel movements and QC/Quantity checks logged digitally.</w:t>
+      </w:r>
+    </w:p>
+    <w:p>
+      <w:r>
+        <w:pict w14:anchorId="137A4BD1">
+          <v:rect id="_x0000_i1026" style="width:0;height:1.5pt" o:hralign="center" o:hrstd="t" o:hrnoshade="t" o:hr="t" fillcolor="gray" stroked="f"/>
+        </w:pict>
       </w:r>
     </w:p>
     <w:p>
@@ -212,7 +214,7 @@
       <w:pPr>
         <w:numPr>
           <w:ilvl w:val="0"/>
-          <w:numId w:val="3"/>
+          <w:numId w:val="8"/>
         </w:numPr>
       </w:pPr>
       <w:r>
@@ -223,14 +225,14 @@
         <w:t>In-Scope:</w:t>
       </w:r>
       <w:r>
-        <w:t xml:space="preserve"> AIS vessel tracking, digital berth planning, operational timesheets, automated quality/volume reconciliation, and management dashboards.</w:t>
+        <w:t xml:space="preserve"> Shipping Instruction visibility, Vessel allocation/berthing management, Loading/Unloading flow automation with SLA formulas, QC/Quantity check logging, Exception approval workflows, Jetty downtime management, and Master Data (Port/Jetty/SLA).</w:t>
       </w:r>
     </w:p>
     <w:p>
       <w:pPr>
         <w:numPr>
           <w:ilvl w:val="0"/>
-          <w:numId w:val="3"/>
+          <w:numId w:val="8"/>
         </w:numPr>
       </w:pPr>
       <w:r>
@@ -241,112 +243,14 @@
         <w:t>Out-of-Scope:</w:t>
       </w:r>
       <w:r>
-        <w:t xml:space="preserve"> Automated physical valve control or refinery machinery automation.</w:t>
+        <w:t xml:space="preserve"> Direct integration with vessel AIS (Global GPS) for real-time tracking (vessel position is manual update), Automated weather hardware (uses Google API instead).</w:t>
       </w:r>
     </w:p>
     <w:p>
-      <w:pPr>
-        <w:rPr>
-          <w:b/>
-          <w:bCs/>
-        </w:rPr>
-      </w:pPr>
       <w:r>
-        <w:rPr>
-          <w:b/>
-          <w:bCs/>
-        </w:rPr>
-        <w:t>5. Business or User Flow</w:t>
-      </w:r>
-    </w:p>
-    <w:p>
-      <w:pPr>
-        <w:numPr>
-          <w:ilvl w:val="0"/>
-          <w:numId w:val="4"/>
-        </w:numPr>
-      </w:pPr>
-      <w:r>
-        <w:rPr>
-          <w:b/>
-          <w:bCs/>
-        </w:rPr>
-        <w:t>Ship Position Update:</w:t>
-      </w:r>
-      <w:r>
-        <w:t xml:space="preserve"> External Agents nominate vessels with ETA and load quality.</w:t>
-      </w:r>
-    </w:p>
-    <w:p>
-      <w:pPr>
-        <w:numPr>
-          <w:ilvl w:val="0"/>
-          <w:numId w:val="4"/>
-        </w:numPr>
-      </w:pPr>
-      <w:r>
-        <w:rPr>
-          <w:b/>
-          <w:bCs/>
-        </w:rPr>
-        <w:t>Jetty Allocation:</w:t>
-      </w:r>
-      <w:r>
-        <w:t xml:space="preserve"> PPIC and Jetty Team plan the sequence based on refinery needs.</w:t>
-      </w:r>
-    </w:p>
-    <w:p>
-      <w:pPr>
-        <w:numPr>
-          <w:ilvl w:val="0"/>
-          <w:numId w:val="4"/>
-        </w:numPr>
-      </w:pPr>
-      <w:r>
-        <w:rPr>
-          <w:b/>
-          <w:bCs/>
-        </w:rPr>
-        <w:t>Ship Docking:</w:t>
-      </w:r>
-      <w:r>
-        <w:t xml:space="preserve"> Recording of actual arrival and connection timestamps.</w:t>
-      </w:r>
-    </w:p>
-    <w:p>
-      <w:pPr>
-        <w:numPr>
-          <w:ilvl w:val="0"/>
-          <w:numId w:val="4"/>
-        </w:numPr>
-      </w:pPr>
-      <w:r>
-        <w:rPr>
-          <w:b/>
-          <w:bCs/>
-        </w:rPr>
-        <w:t>Offloading:</w:t>
-      </w:r>
-      <w:r>
-        <w:t xml:space="preserve"> Detailed activity logging, including pumping and tank cleaning.</w:t>
-      </w:r>
-    </w:p>
-    <w:p>
-      <w:pPr>
-        <w:numPr>
-          <w:ilvl w:val="0"/>
-          <w:numId w:val="4"/>
-        </w:numPr>
-      </w:pPr>
-      <w:r>
-        <w:rPr>
-          <w:b/>
-          <w:bCs/>
-        </w:rPr>
-        <w:t>Ship Discharge:</w:t>
-      </w:r>
-      <w:r>
-        <w:t xml:space="preserve"> Final reconciliation of volume/quality and issuance of "Dry Cert".</w:t>
+        <w:pict w14:anchorId="55BB4D9E">
+          <v:rect id="_x0000_i1027" style="width:0;height:1.5pt" o:hralign="center" o:hrstd="t" o:hrnoshade="t" o:hr="t" fillcolor="gray" stroked="f"/>
+        </w:pict>
       </w:r>
     </w:p>
     <w:p>
@@ -362,6 +266,748 @@
           <w:bCs/>
         </w:rPr>
         <w:lastRenderedPageBreak/>
+        <w:t>5. Business or User Flow</w:t>
+      </w:r>
+    </w:p>
+    <w:p>
+      <w:r>
+        <w:t xml:space="preserve">The system follows two primary paths: </w:t>
+      </w:r>
+      <w:r>
+        <w:rPr>
+          <w:b/>
+          <w:bCs/>
+        </w:rPr>
+        <w:t>Unloading (Purchasing)</w:t>
+      </w:r>
+      <w:r>
+        <w:t xml:space="preserve"> and </w:t>
+      </w:r>
+      <w:r>
+        <w:rPr>
+          <w:b/>
+          <w:bCs/>
+        </w:rPr>
+        <w:t>Loading (Sales)</w:t>
+      </w:r>
+      <w:r>
+        <w:t>.</w:t>
+      </w:r>
+    </w:p>
+    <w:p>
+      <w:pPr>
+        <w:rPr>
+          <w:b/>
+          <w:bCs/>
+        </w:rPr>
+      </w:pPr>
+      <w:r>
+        <w:rPr>
+          <w:b/>
+          <w:bCs/>
+        </w:rPr>
+        <w:t>The SLA Formula</w:t>
+      </w:r>
+    </w:p>
+    <w:p>
+      <w:r>
+        <w:t>The system automatically calculates the Estimated Completion for activities using the following logic:</w:t>
+      </w:r>
+    </w:p>
+    <w:p>
+      <m:oMathPara>
+        <m:oMath>
+          <m:r>
+            <w:rPr>
+              <w:rFonts w:ascii="Cambria Math" w:hAnsi="Cambria Math"/>
+            </w:rPr>
+            <m:t>SLA=</m:t>
+          </m:r>
+          <m:sSub>
+            <m:sSubPr>
+              <m:ctrlPr>
+                <w:rPr>
+                  <w:rFonts w:ascii="Cambria Math" w:hAnsi="Cambria Math"/>
+                  <w:i/>
+                </w:rPr>
+              </m:ctrlPr>
+            </m:sSubPr>
+            <m:e>
+              <m:r>
+                <w:rPr>
+                  <w:rFonts w:ascii="Cambria Math" w:hAnsi="Cambria Math"/>
+                </w:rPr>
+                <m:t>Q</m:t>
+              </m:r>
+            </m:e>
+            <m:sub>
+              <m:r>
+                <w:rPr>
+                  <w:rFonts w:ascii="Cambria Math" w:hAnsi="Cambria Math"/>
+                </w:rPr>
+                <m:t>1</m:t>
+              </m:r>
+            </m:sub>
+          </m:sSub>
+          <m:r>
+            <w:rPr>
+              <w:rFonts w:ascii="Cambria Math" w:hAnsi="Cambria Math"/>
+            </w:rPr>
+            <m:t>+</m:t>
+          </m:r>
+          <m:sSub>
+            <m:sSubPr>
+              <m:ctrlPr>
+                <w:rPr>
+                  <w:rFonts w:ascii="Cambria Math" w:hAnsi="Cambria Math"/>
+                  <w:i/>
+                </w:rPr>
+              </m:ctrlPr>
+            </m:sSubPr>
+            <m:e>
+              <m:r>
+                <w:rPr>
+                  <w:rFonts w:ascii="Cambria Math" w:hAnsi="Cambria Math"/>
+                </w:rPr>
+                <m:t>Q</m:t>
+              </m:r>
+            </m:e>
+            <m:sub>
+              <m:r>
+                <w:rPr>
+                  <w:rFonts w:ascii="Cambria Math" w:hAnsi="Cambria Math"/>
+                </w:rPr>
+                <m:t>2</m:t>
+              </m:r>
+            </m:sub>
+          </m:sSub>
+          <m:r>
+            <w:rPr>
+              <w:rFonts w:ascii="Cambria Math" w:hAnsi="Cambria Math"/>
+            </w:rPr>
+            <m:t>+C+</m:t>
+          </m:r>
+          <m:d>
+            <m:dPr>
+              <m:ctrlPr>
+                <w:rPr>
+                  <w:rFonts w:ascii="Cambria Math" w:hAnsi="Cambria Math"/>
+                  <w:i/>
+                </w:rPr>
+              </m:ctrlPr>
+            </m:dPr>
+            <m:e>
+              <m:f>
+                <m:fPr>
+                  <m:ctrlPr>
+                    <w:rPr>
+                      <w:rFonts w:ascii="Cambria Math" w:hAnsi="Cambria Math"/>
+                      <w:i/>
+                    </w:rPr>
+                  </m:ctrlPr>
+                </m:fPr>
+                <m:num>
+                  <m:nary>
+                    <m:naryPr>
+                      <m:chr m:val="∑"/>
+                      <m:limLoc m:val="undOvr"/>
+                      <m:subHide m:val="1"/>
+                      <m:supHide m:val="1"/>
+                      <m:ctrlPr>
+                        <w:rPr>
+                          <w:rFonts w:ascii="Cambria Math" w:hAnsi="Cambria Math"/>
+                          <w:i/>
+                        </w:rPr>
+                      </m:ctrlPr>
+                    </m:naryPr>
+                    <m:sub/>
+                    <m:sup/>
+                    <m:e>
+                      <m:sSub>
+                        <m:sSubPr>
+                          <m:ctrlPr>
+                            <w:rPr>
+                              <w:rFonts w:ascii="Cambria Math" w:hAnsi="Cambria Math"/>
+                              <w:i/>
+                            </w:rPr>
+                          </m:ctrlPr>
+                        </m:sSubPr>
+                        <m:e>
+                          <m:r>
+                            <w:rPr>
+                              <w:rFonts w:ascii="Cambria Math" w:hAnsi="Cambria Math"/>
+                            </w:rPr>
+                            <m:t>V</m:t>
+                          </m:r>
+                        </m:e>
+                        <m:sub>
+                          <m:r>
+                            <w:rPr>
+                              <w:rFonts w:ascii="Cambria Math" w:hAnsi="Cambria Math"/>
+                            </w:rPr>
+                            <m:t>n</m:t>
+                          </m:r>
+                        </m:sub>
+                      </m:sSub>
+                    </m:e>
+                  </m:nary>
+                </m:num>
+                <m:den>
+                  <m:r>
+                    <w:rPr>
+                      <w:rFonts w:ascii="Cambria Math" w:hAnsi="Cambria Math"/>
+                    </w:rPr>
+                    <m:t>Standard Rate ×Buffer</m:t>
+                  </m:r>
+                </m:den>
+              </m:f>
+            </m:e>
+          </m:d>
+          <m:r>
+            <w:rPr>
+              <w:rFonts w:ascii="Cambria Math" w:hAnsi="Cambria Math"/>
+            </w:rPr>
+            <m:t>+(</m:t>
+          </m:r>
+          <m:d>
+            <m:dPr>
+              <m:ctrlPr>
+                <w:rPr>
+                  <w:rFonts w:ascii="Cambria Math" w:hAnsi="Cambria Math"/>
+                  <w:i/>
+                </w:rPr>
+              </m:ctrlPr>
+            </m:dPr>
+            <m:e>
+              <m:r>
+                <w:rPr>
+                  <w:rFonts w:ascii="Cambria Math" w:hAnsi="Cambria Math"/>
+                </w:rPr>
+                <m:t>n-1</m:t>
+              </m:r>
+            </m:e>
+          </m:d>
+          <m:r>
+            <w:rPr>
+              <w:rFonts w:ascii="Cambria Math" w:hAnsi="Cambria Math"/>
+            </w:rPr>
+            <m:t xml:space="preserve"> ×S)</m:t>
+          </m:r>
+        </m:oMath>
+      </m:oMathPara>
+    </w:p>
+    <w:tbl>
+      <w:tblPr>
+        <w:tblStyle w:val="TableGrid"/>
+        <w:tblW w:w="0" w:type="auto"/>
+        <w:tblLook w:val="04A0" w:firstRow="1" w:lastRow="0" w:firstColumn="1" w:lastColumn="0" w:noHBand="0" w:noVBand="1"/>
+      </w:tblPr>
+      <w:tblGrid>
+        <w:gridCol w:w="1802"/>
+        <w:gridCol w:w="4043"/>
+      </w:tblGrid>
+      <w:tr>
+        <w:tc>
+          <w:tcPr>
+            <w:tcW w:w="1802" w:type="dxa"/>
+          </w:tcPr>
+          <w:p>
+            <w:pPr>
+              <w:rPr>
+                <w:rFonts w:ascii="Calibri" w:eastAsia="Times New Roman" w:hAnsi="Calibri" w:cs="Times New Roman"/>
+              </w:rPr>
+            </w:pPr>
+            <w:r>
+              <w:rPr>
+                <w:rFonts w:ascii="Calibri" w:eastAsia="Calibri" w:hAnsi="Calibri" w:cs="Times New Roman"/>
+                <w:b/>
+                <w:bCs/>
+              </w:rPr>
+              <w:t>Equation</w:t>
+            </w:r>
+          </w:p>
+        </w:tc>
+        <w:tc>
+          <w:tcPr>
+            <w:tcW w:w="4043" w:type="dxa"/>
+          </w:tcPr>
+          <w:p>
+            <w:r>
+              <w:rPr>
+                <w:b/>
+                <w:bCs/>
+              </w:rPr>
+              <w:t>Description</w:t>
+            </w:r>
+          </w:p>
+        </w:tc>
+      </w:tr>
+      <w:tr>
+        <w:tc>
+          <w:tcPr>
+            <w:tcW w:w="1802" w:type="dxa"/>
+          </w:tcPr>
+          <w:p>
+            <w:pPr>
+              <w:rPr>
+                <w:rFonts w:eastAsiaTheme="minorEastAsia"/>
+              </w:rPr>
+            </w:pPr>
+            <m:oMathPara>
+              <m:oMath>
+                <m:sSub>
+                  <m:sSubPr>
+                    <m:ctrlPr>
+                      <w:rPr>
+                        <w:rFonts w:ascii="Cambria Math" w:hAnsi="Cambria Math"/>
+                        <w:i/>
+                      </w:rPr>
+                    </m:ctrlPr>
+                  </m:sSubPr>
+                  <m:e>
+                    <m:r>
+                      <w:rPr>
+                        <w:rFonts w:ascii="Cambria Math" w:hAnsi="Cambria Math"/>
+                      </w:rPr>
+                      <m:t>Q</m:t>
+                    </m:r>
+                  </m:e>
+                  <m:sub>
+                    <m:r>
+                      <w:rPr>
+                        <w:rFonts w:ascii="Cambria Math" w:hAnsi="Cambria Math"/>
+                      </w:rPr>
+                      <m:t>1</m:t>
+                    </m:r>
+                  </m:sub>
+                </m:sSub>
+              </m:oMath>
+            </m:oMathPara>
+          </w:p>
+        </w:tc>
+        <w:tc>
+          <w:tcPr>
+            <w:tcW w:w="4043" w:type="dxa"/>
+          </w:tcPr>
+          <w:p>
+            <w:pPr>
+              <w:rPr>
+                <w:rFonts w:eastAsiaTheme="minorEastAsia"/>
+              </w:rPr>
+            </w:pPr>
+            <w:r>
+              <w:t xml:space="preserve">Quality &amp; Quantity checking </w:t>
+            </w:r>
+          </w:p>
+        </w:tc>
+      </w:tr>
+      <w:tr>
+        <w:tc>
+          <w:tcPr>
+            <w:tcW w:w="1802" w:type="dxa"/>
+          </w:tcPr>
+          <w:p>
+            <w:pPr>
+              <w:rPr>
+                <w:rFonts w:ascii="Calibri" w:eastAsia="Calibri" w:hAnsi="Calibri" w:cs="Times New Roman"/>
+              </w:rPr>
+            </w:pPr>
+            <m:oMathPara>
+              <m:oMath>
+                <m:sSub>
+                  <m:sSubPr>
+                    <m:ctrlPr>
+                      <w:rPr>
+                        <w:rFonts w:ascii="Cambria Math" w:hAnsi="Cambria Math"/>
+                        <w:i/>
+                      </w:rPr>
+                    </m:ctrlPr>
+                  </m:sSubPr>
+                  <m:e>
+                    <m:r>
+                      <w:rPr>
+                        <w:rFonts w:ascii="Cambria Math" w:hAnsi="Cambria Math"/>
+                      </w:rPr>
+                      <m:t>Q</m:t>
+                    </m:r>
+                  </m:e>
+                  <m:sub>
+                    <m:r>
+                      <w:rPr>
+                        <w:rFonts w:ascii="Cambria Math" w:hAnsi="Cambria Math"/>
+                      </w:rPr>
+                      <m:t>2</m:t>
+                    </m:r>
+                  </m:sub>
+                </m:sSub>
+              </m:oMath>
+            </m:oMathPara>
+          </w:p>
+        </w:tc>
+        <w:tc>
+          <w:tcPr>
+            <w:tcW w:w="4043" w:type="dxa"/>
+          </w:tcPr>
+          <w:p>
+            <w:pPr>
+              <w:rPr>
+                <w:rFonts w:eastAsiaTheme="minorEastAsia"/>
+              </w:rPr>
+            </w:pPr>
+            <w:r>
+              <w:t xml:space="preserve">Final Quality &amp; Quantity checking </w:t>
+            </w:r>
+          </w:p>
+        </w:tc>
+      </w:tr>
+      <w:tr>
+        <w:tc>
+          <w:tcPr>
+            <w:tcW w:w="1802" w:type="dxa"/>
+          </w:tcPr>
+          <w:p>
+            <w:pPr>
+              <w:jc w:val="center"/>
+              <w:rPr>
+                <w:rFonts w:ascii="Calibri" w:eastAsia="Calibri" w:hAnsi="Calibri" w:cs="Times New Roman"/>
+              </w:rPr>
+            </w:pPr>
+            <w:r>
+              <w:t>C</w:t>
+            </w:r>
+          </w:p>
+        </w:tc>
+        <w:tc>
+          <w:tcPr>
+            <w:tcW w:w="4043" w:type="dxa"/>
+          </w:tcPr>
+          <w:p>
+            <w:pPr>
+              <w:rPr>
+                <w:rFonts w:eastAsiaTheme="minorEastAsia"/>
+              </w:rPr>
+            </w:pPr>
+            <w:r>
+              <w:t xml:space="preserve">Clearance  </w:t>
+            </w:r>
+          </w:p>
+        </w:tc>
+      </w:tr>
+      <w:tr>
+        <w:tc>
+          <w:tcPr>
+            <w:tcW w:w="1802" w:type="dxa"/>
+          </w:tcPr>
+          <w:p>
+            <w:pPr>
+              <w:rPr>
+                <w:rFonts w:ascii="Calibri" w:eastAsia="Calibri" w:hAnsi="Calibri" w:cs="Times New Roman"/>
+              </w:rPr>
+            </w:pPr>
+            <m:oMathPara>
+              <m:oMath>
+                <m:nary>
+                  <m:naryPr>
+                    <m:chr m:val="∑"/>
+                    <m:limLoc m:val="undOvr"/>
+                    <m:subHide m:val="1"/>
+                    <m:supHide m:val="1"/>
+                    <m:ctrlPr>
+                      <w:rPr>
+                        <w:rFonts w:ascii="Cambria Math" w:hAnsi="Cambria Math"/>
+                        <w:i/>
+                      </w:rPr>
+                    </m:ctrlPr>
+                  </m:naryPr>
+                  <m:sub/>
+                  <m:sup/>
+                  <m:e>
+                    <m:sSub>
+                      <m:sSubPr>
+                        <m:ctrlPr>
+                          <w:rPr>
+                            <w:rFonts w:ascii="Cambria Math" w:hAnsi="Cambria Math"/>
+                            <w:i/>
+                          </w:rPr>
+                        </m:ctrlPr>
+                      </m:sSubPr>
+                      <m:e>
+                        <m:r>
+                          <w:rPr>
+                            <w:rFonts w:ascii="Cambria Math" w:hAnsi="Cambria Math"/>
+                          </w:rPr>
+                          <m:t>V</m:t>
+                        </m:r>
+                      </m:e>
+                      <m:sub>
+                        <m:r>
+                          <w:rPr>
+                            <w:rFonts w:ascii="Cambria Math" w:hAnsi="Cambria Math"/>
+                          </w:rPr>
+                          <m:t>n</m:t>
+                        </m:r>
+                      </m:sub>
+                    </m:sSub>
+                  </m:e>
+                </m:nary>
+              </m:oMath>
+            </m:oMathPara>
+          </w:p>
+        </w:tc>
+        <w:tc>
+          <w:tcPr>
+            <w:tcW w:w="4043" w:type="dxa"/>
+          </w:tcPr>
+          <w:p>
+            <w:pPr>
+              <w:rPr>
+                <w:rFonts w:eastAsiaTheme="minorEastAsia"/>
+              </w:rPr>
+            </w:pPr>
+            <w:r>
+              <w:rPr>
+                <w:rFonts w:eastAsiaTheme="minorEastAsia"/>
+              </w:rPr>
+              <w:t>The total sum of all material volumes</w:t>
+            </w:r>
+            <w:r>
+              <w:rPr>
+                <w:rFonts w:eastAsiaTheme="minorEastAsia"/>
+              </w:rPr>
+              <w:t>.</w:t>
+            </w:r>
+          </w:p>
+        </w:tc>
+      </w:tr>
+      <w:tr>
+        <w:tc>
+          <w:tcPr>
+            <w:tcW w:w="1802" w:type="dxa"/>
+          </w:tcPr>
+          <w:p>
+            <w:pPr>
+              <w:rPr>
+                <w:rFonts w:ascii="Calibri" w:eastAsia="Calibri" w:hAnsi="Calibri" w:cs="Times New Roman"/>
+              </w:rPr>
+            </w:pPr>
+            <m:oMathPara>
+              <m:oMath>
+                <m:r>
+                  <w:rPr>
+                    <w:rFonts w:ascii="Cambria Math" w:hAnsi="Cambria Math"/>
+                  </w:rPr>
+                  <m:t>Standard Rate</m:t>
+                </m:r>
+              </m:oMath>
+            </m:oMathPara>
+          </w:p>
+        </w:tc>
+        <w:tc>
+          <w:tcPr>
+            <w:tcW w:w="4043" w:type="dxa"/>
+          </w:tcPr>
+          <w:p>
+            <w:pPr>
+              <w:rPr>
+                <w:rFonts w:eastAsiaTheme="minorEastAsia"/>
+              </w:rPr>
+            </w:pPr>
+            <w:r>
+              <w:rPr>
+                <w:rFonts w:eastAsiaTheme="minorEastAsia"/>
+              </w:rPr>
+              <w:t>the "Planned Speed" at which material moves through your pipes or loading arms.</w:t>
+            </w:r>
+          </w:p>
+        </w:tc>
+      </w:tr>
+      <w:tr>
+        <w:tc>
+          <w:tcPr>
+            <w:tcW w:w="1802" w:type="dxa"/>
+          </w:tcPr>
+          <w:p>
+            <w:pPr>
+              <w:rPr>
+                <w:rFonts w:ascii="Calibri" w:eastAsia="Times New Roman" w:hAnsi="Calibri" w:cs="Times New Roman"/>
+              </w:rPr>
+            </w:pPr>
+            <m:oMathPara>
+              <m:oMath>
+                <m:r>
+                  <w:rPr>
+                    <w:rFonts w:ascii="Cambria Math" w:eastAsiaTheme="minorEastAsia" w:hAnsi="Cambria Math"/>
+                  </w:rPr>
+                  <m:t>Buffer</m:t>
+                </m:r>
+              </m:oMath>
+            </m:oMathPara>
+          </w:p>
+        </w:tc>
+        <w:tc>
+          <w:tcPr>
+            <w:tcW w:w="4043" w:type="dxa"/>
+          </w:tcPr>
+          <w:p>
+            <w:pPr>
+              <w:rPr>
+                <w:rFonts w:eastAsiaTheme="minorEastAsia"/>
+              </w:rPr>
+            </w:pPr>
+            <w:r>
+              <w:rPr>
+                <w:rFonts w:eastAsiaTheme="minorEastAsia"/>
+              </w:rPr>
+              <w:t>configurable variable (default 0.85) that can be adjusted based on historical vessel performance</w:t>
+            </w:r>
+          </w:p>
+        </w:tc>
+      </w:tr>
+      <w:tr>
+        <w:tc>
+          <w:tcPr>
+            <w:tcW w:w="1802" w:type="dxa"/>
+          </w:tcPr>
+          <w:p>
+            <w:pPr>
+              <w:rPr>
+                <w:rFonts w:ascii="Calibri" w:eastAsia="Times New Roman" w:hAnsi="Calibri" w:cs="Times New Roman"/>
+              </w:rPr>
+            </w:pPr>
+            <m:oMathPara>
+              <m:oMath>
+                <m:r>
+                  <w:rPr>
+                    <w:rFonts w:ascii="Cambria Math" w:hAnsi="Cambria Math"/>
+                  </w:rPr>
+                  <m:t>n</m:t>
+                </m:r>
+              </m:oMath>
+            </m:oMathPara>
+          </w:p>
+        </w:tc>
+        <w:tc>
+          <w:tcPr>
+            <w:tcW w:w="4043" w:type="dxa"/>
+          </w:tcPr>
+          <w:p>
+            <w:pPr>
+              <w:rPr>
+                <w:rFonts w:eastAsiaTheme="minorEastAsia"/>
+              </w:rPr>
+            </w:pPr>
+            <w:r>
+              <w:rPr>
+                <w:rFonts w:eastAsiaTheme="minorEastAsia"/>
+              </w:rPr>
+              <w:t>The number of different material types.</w:t>
+            </w:r>
+          </w:p>
+        </w:tc>
+      </w:tr>
+      <w:tr>
+        <w:tc>
+          <w:tcPr>
+            <w:tcW w:w="1802" w:type="dxa"/>
+          </w:tcPr>
+          <w:p>
+            <w:pPr>
+              <w:rPr>
+                <w:rFonts w:ascii="Calibri" w:eastAsia="Times New Roman" w:hAnsi="Calibri" w:cs="Times New Roman"/>
+              </w:rPr>
+            </w:pPr>
+            <m:oMathPara>
+              <m:oMath>
+                <m:r>
+                  <w:rPr>
+                    <w:rFonts w:ascii="Cambria Math" w:hAnsi="Cambria Math"/>
+                  </w:rPr>
+                  <m:t>S</m:t>
+                </m:r>
+              </m:oMath>
+            </m:oMathPara>
+          </w:p>
+        </w:tc>
+        <w:tc>
+          <w:tcPr>
+            <w:tcW w:w="4043" w:type="dxa"/>
+          </w:tcPr>
+          <w:p>
+            <w:pPr>
+              <w:rPr>
+                <w:rFonts w:eastAsiaTheme="minorEastAsia"/>
+              </w:rPr>
+            </w:pPr>
+            <w:r>
+              <w:rPr>
+                <w:rFonts w:eastAsiaTheme="minorEastAsia"/>
+              </w:rPr>
+              <w:t xml:space="preserve">A fixed penalty (suggested </w:t>
+            </w:r>
+            <w:r>
+              <w:rPr>
+                <w:rFonts w:eastAsiaTheme="minorEastAsia"/>
+                <w:b/>
+                <w:bCs/>
+              </w:rPr>
+              <w:t>1 hour</w:t>
+            </w:r>
+            <w:r>
+              <w:rPr>
+                <w:rFonts w:eastAsiaTheme="minorEastAsia"/>
+              </w:rPr>
+              <w:t>) for cleaning, flushing, or re-connecting hoses.</w:t>
+            </w:r>
+            <w:r>
+              <w:rPr>
+                <w:rFonts w:eastAsiaTheme="minorEastAsia"/>
+              </w:rPr>
+              <w:br/>
+            </w:r>
+            <w:r>
+              <w:rPr>
+                <w:rFonts w:eastAsiaTheme="minorEastAsia"/>
+              </w:rPr>
+              <w:br/>
+              <w:t xml:space="preserve">Why? </w:t>
+            </w:r>
+            <w:r>
+              <w:rPr>
+                <w:rFonts w:eastAsiaTheme="minorEastAsia"/>
+                <w:i/>
+                <w:iCs/>
+              </w:rPr>
+              <w:t>when different materials share the same pipeline and require "pugging" or flushing in between.</w:t>
+            </w:r>
+          </w:p>
+        </w:tc>
+      </w:tr>
+    </w:tbl>
+    <w:p/>
+    <w:p>
+      <w:r>
+        <w:t xml:space="preserve">Note. All variables are configurable in the system. </w:t>
+      </w:r>
+    </w:p>
+    <w:p>
+      <w:r>
+        <w:pict w14:anchorId="0D9D90B0">
+          <v:rect id="_x0000_i1046" style="width:0;height:1.5pt" o:hralign="center" o:hrstd="t" o:hrnoshade="t" o:hr="t" fillcolor="gray" stroked="f"/>
+        </w:pict>
+      </w:r>
+    </w:p>
+    <w:p>
+      <w:pPr>
+        <w:rPr>
+          <w:b/>
+          <w:bCs/>
+        </w:rPr>
+      </w:pPr>
+      <w:r>
+        <w:rPr>
+          <w:b/>
+          <w:bCs/>
+        </w:rPr>
         <w:t>6. User Stories</w:t>
       </w:r>
     </w:p>
@@ -376,10 +1022,10 @@
         <w:tblLook w:val="04A0" w:firstRow="1" w:lastRow="0" w:firstColumn="1" w:lastColumn="0" w:noHBand="0" w:noVBand="1"/>
       </w:tblPr>
       <w:tblGrid>
-        <w:gridCol w:w="723"/>
-        <w:gridCol w:w="1574"/>
-        <w:gridCol w:w="4449"/>
-        <w:gridCol w:w="2598"/>
+        <w:gridCol w:w="543"/>
+        <w:gridCol w:w="1501"/>
+        <w:gridCol w:w="3609"/>
+        <w:gridCol w:w="3691"/>
       </w:tblGrid>
       <w:tr>
         <w:trPr>
@@ -396,9 +1042,9 @@
               <w:right w:val="single" w:sz="6" w:space="0" w:color="auto"/>
             </w:tcBorders>
             <w:tcMar>
-              <w:top w:w="120" w:type="dxa"/>
-              <w:left w:w="180" w:type="dxa"/>
-              <w:bottom w:w="120" w:type="dxa"/>
+              <w:top w:w="240" w:type="dxa"/>
+              <w:left w:w="0" w:type="dxa"/>
+              <w:bottom w:w="240" w:type="dxa"/>
               <w:right w:w="180" w:type="dxa"/>
             </w:tcMar>
             <w:vAlign w:val="center"/>
@@ -410,6 +1056,7 @@
                 <w:b/>
                 <w:bCs/>
               </w:rPr>
+              <w:lastRenderedPageBreak/>
               <w:t>No</w:t>
             </w:r>
           </w:p>
@@ -424,9 +1071,9 @@
               <w:right w:val="single" w:sz="6" w:space="0" w:color="auto"/>
             </w:tcBorders>
             <w:tcMar>
-              <w:top w:w="120" w:type="dxa"/>
-              <w:left w:w="180" w:type="dxa"/>
-              <w:bottom w:w="120" w:type="dxa"/>
+              <w:top w:w="240" w:type="dxa"/>
+              <w:left w:w="0" w:type="dxa"/>
+              <w:bottom w:w="240" w:type="dxa"/>
               <w:right w:w="180" w:type="dxa"/>
             </w:tcMar>
             <w:vAlign w:val="center"/>
@@ -452,9 +1099,9 @@
               <w:right w:val="single" w:sz="6" w:space="0" w:color="auto"/>
             </w:tcBorders>
             <w:tcMar>
-              <w:top w:w="120" w:type="dxa"/>
-              <w:left w:w="180" w:type="dxa"/>
-              <w:bottom w:w="120" w:type="dxa"/>
+              <w:top w:w="240" w:type="dxa"/>
+              <w:left w:w="0" w:type="dxa"/>
+              <w:bottom w:w="240" w:type="dxa"/>
               <w:right w:w="180" w:type="dxa"/>
             </w:tcMar>
             <w:vAlign w:val="center"/>
@@ -480,10 +1127,10 @@
               <w:right w:val="single" w:sz="6" w:space="0" w:color="auto"/>
             </w:tcBorders>
             <w:tcMar>
-              <w:top w:w="120" w:type="dxa"/>
-              <w:left w:w="180" w:type="dxa"/>
-              <w:bottom w:w="120" w:type="dxa"/>
-              <w:right w:w="180" w:type="dxa"/>
+              <w:top w:w="240" w:type="dxa"/>
+              <w:left w:w="0" w:type="dxa"/>
+              <w:bottom w:w="240" w:type="dxa"/>
+              <w:right w:w="0" w:type="dxa"/>
             </w:tcMar>
             <w:vAlign w:val="center"/>
             <w:hideMark/>
@@ -513,9 +1160,9 @@
               <w:right w:val="single" w:sz="6" w:space="0" w:color="auto"/>
             </w:tcBorders>
             <w:tcMar>
-              <w:top w:w="120" w:type="dxa"/>
-              <w:left w:w="180" w:type="dxa"/>
-              <w:bottom w:w="120" w:type="dxa"/>
+              <w:top w:w="240" w:type="dxa"/>
+              <w:left w:w="0" w:type="dxa"/>
+              <w:bottom w:w="240" w:type="dxa"/>
               <w:right w:w="180" w:type="dxa"/>
             </w:tcMar>
             <w:vAlign w:val="center"/>
@@ -537,9 +1184,9 @@
               <w:right w:val="single" w:sz="6" w:space="0" w:color="auto"/>
             </w:tcBorders>
             <w:tcMar>
-              <w:top w:w="120" w:type="dxa"/>
-              <w:left w:w="180" w:type="dxa"/>
-              <w:bottom w:w="120" w:type="dxa"/>
+              <w:top w:w="240" w:type="dxa"/>
+              <w:left w:w="0" w:type="dxa"/>
+              <w:bottom w:w="240" w:type="dxa"/>
               <w:right w:w="180" w:type="dxa"/>
             </w:tcMar>
             <w:vAlign w:val="center"/>
@@ -551,23 +1198,23 @@
                 <w:b/>
                 <w:bCs/>
               </w:rPr>
-              <w:t>Dashboard</w:t>
-            </w:r>
-          </w:p>
-        </w:tc>
-        <w:tc>
-          <w:tcPr>
-            <w:tcW w:w="0" w:type="auto"/>
-            <w:tcBorders>
-              <w:top w:val="single" w:sz="6" w:space="0" w:color="auto"/>
-              <w:left w:val="single" w:sz="6" w:space="0" w:color="auto"/>
-              <w:bottom w:val="single" w:sz="6" w:space="0" w:color="auto"/>
-              <w:right w:val="single" w:sz="6" w:space="0" w:color="auto"/>
-            </w:tcBorders>
-            <w:tcMar>
-              <w:top w:w="120" w:type="dxa"/>
-              <w:left w:w="180" w:type="dxa"/>
-              <w:bottom w:w="120" w:type="dxa"/>
+              <w:t>Shipping Instruction</w:t>
+            </w:r>
+          </w:p>
+        </w:tc>
+        <w:tc>
+          <w:tcPr>
+            <w:tcW w:w="0" w:type="auto"/>
+            <w:tcBorders>
+              <w:top w:val="single" w:sz="6" w:space="0" w:color="auto"/>
+              <w:left w:val="single" w:sz="6" w:space="0" w:color="auto"/>
+              <w:bottom w:val="single" w:sz="6" w:space="0" w:color="auto"/>
+              <w:right w:val="single" w:sz="6" w:space="0" w:color="auto"/>
+            </w:tcBorders>
+            <w:tcMar>
+              <w:top w:w="240" w:type="dxa"/>
+              <w:left w:w="0" w:type="dxa"/>
+              <w:bottom w:w="240" w:type="dxa"/>
               <w:right w:w="180" w:type="dxa"/>
             </w:tcMar>
             <w:vAlign w:val="center"/>
@@ -575,48 +1222,31 @@
           </w:tcPr>
           <w:p>
             <w:r>
-              <w:rPr>
-                <w:b/>
-                <w:bCs/>
-              </w:rPr>
-              <w:t>As a member of Management</w:t>
-            </w:r>
-            <w:r>
-              <w:t xml:space="preserve">, I want a </w:t>
-            </w:r>
-            <w:r>
-              <w:rPr>
-                <w:b/>
-                <w:bCs/>
-              </w:rPr>
-              <w:t>one-pager dashboard</w:t>
-            </w:r>
-            <w:r>
-              <w:t xml:space="preserve"> that shows live jetty occupancy, 8-day wait alerts, and loss/gain percentages, so I can make rapid strategic decisions without reviewing multiple files.</w:t>
-            </w:r>
-          </w:p>
-        </w:tc>
-        <w:tc>
-          <w:tcPr>
-            <w:tcW w:w="0" w:type="auto"/>
-            <w:tcBorders>
-              <w:top w:val="single" w:sz="6" w:space="0" w:color="auto"/>
-              <w:left w:val="single" w:sz="6" w:space="0" w:color="auto"/>
-              <w:bottom w:val="single" w:sz="6" w:space="0" w:color="auto"/>
-              <w:right w:val="single" w:sz="6" w:space="0" w:color="auto"/>
-            </w:tcBorders>
-            <w:tcMar>
-              <w:top w:w="120" w:type="dxa"/>
-              <w:left w:w="180" w:type="dxa"/>
-              <w:bottom w:w="120" w:type="dxa"/>
-              <w:right w:w="180" w:type="dxa"/>
-            </w:tcMar>
-            <w:vAlign w:val="center"/>
-            <w:hideMark/>
-          </w:tcPr>
-          <w:p>
-            <w:r>
-              <w:t>• Real-time map of all 5 berths.</w:t>
+              <w:t>As a Jetty Operator, I want to view the list of incoming Shipping Instructions (SI) so I can see vessel, material, and purpose details.</w:t>
+            </w:r>
+          </w:p>
+        </w:tc>
+        <w:tc>
+          <w:tcPr>
+            <w:tcW w:w="0" w:type="auto"/>
+            <w:tcBorders>
+              <w:top w:val="single" w:sz="6" w:space="0" w:color="auto"/>
+              <w:left w:val="single" w:sz="6" w:space="0" w:color="auto"/>
+              <w:bottom w:val="single" w:sz="6" w:space="0" w:color="auto"/>
+              <w:right w:val="single" w:sz="6" w:space="0" w:color="auto"/>
+            </w:tcBorders>
+            <w:tcMar>
+              <w:top w:w="240" w:type="dxa"/>
+              <w:left w:w="0" w:type="dxa"/>
+              <w:bottom w:w="240" w:type="dxa"/>
+              <w:right w:w="0" w:type="dxa"/>
+            </w:tcMar>
+            <w:vAlign w:val="center"/>
+            <w:hideMark/>
+          </w:tcPr>
+          <w:p>
+            <w:r>
+              <w:t>• Display SI from Logistics &amp; EXIM.</w:t>
             </w:r>
           </w:p>
           <w:p>
@@ -626,17 +1256,7 @@
           </w:p>
           <w:p>
             <w:r>
-              <w:t>• Visual alert for vessels waiting &gt;24 hours.</w:t>
-            </w:r>
-          </w:p>
-          <w:p>
-            <w:r>
-              <w:br/>
-            </w:r>
-          </w:p>
-          <w:p>
-            <w:r>
-              <w:t>• Aggregated Loss/Gain % for the last 10 shipments.</w:t>
+              <w:t>• Filter by purpose (Loading/Unloading).</w:t>
             </w:r>
           </w:p>
         </w:tc>
@@ -655,9 +1275,9 @@
               <w:right w:val="single" w:sz="6" w:space="0" w:color="auto"/>
             </w:tcBorders>
             <w:tcMar>
-              <w:top w:w="120" w:type="dxa"/>
-              <w:left w:w="180" w:type="dxa"/>
-              <w:bottom w:w="120" w:type="dxa"/>
+              <w:top w:w="240" w:type="dxa"/>
+              <w:left w:w="0" w:type="dxa"/>
+              <w:bottom w:w="240" w:type="dxa"/>
               <w:right w:w="180" w:type="dxa"/>
             </w:tcMar>
             <w:vAlign w:val="center"/>
@@ -679,67 +1299,37 @@
               <w:right w:val="single" w:sz="6" w:space="0" w:color="auto"/>
             </w:tcBorders>
             <w:tcMar>
-              <w:top w:w="120" w:type="dxa"/>
-              <w:left w:w="180" w:type="dxa"/>
-              <w:bottom w:w="120" w:type="dxa"/>
+              <w:top w:w="240" w:type="dxa"/>
+              <w:left w:w="0" w:type="dxa"/>
+              <w:bottom w:w="240" w:type="dxa"/>
               <w:right w:w="180" w:type="dxa"/>
             </w:tcMar>
             <w:vAlign w:val="center"/>
             <w:hideMark/>
           </w:tcPr>
           <w:p>
-            <w:r>
-              <w:t>Nomination</w:t>
-            </w:r>
-          </w:p>
-        </w:tc>
-        <w:tc>
-          <w:tcPr>
-            <w:tcW w:w="0" w:type="auto"/>
-            <w:tcBorders>
-              <w:top w:val="single" w:sz="6" w:space="0" w:color="auto"/>
-              <w:left w:val="single" w:sz="6" w:space="0" w:color="auto"/>
-              <w:bottom w:val="single" w:sz="6" w:space="0" w:color="auto"/>
-              <w:right w:val="single" w:sz="6" w:space="0" w:color="auto"/>
-            </w:tcBorders>
-            <w:tcMar>
-              <w:top w:w="120" w:type="dxa"/>
-              <w:left w:w="180" w:type="dxa"/>
-              <w:bottom w:w="120" w:type="dxa"/>
-              <w:right w:w="180" w:type="dxa"/>
-            </w:tcMar>
-            <w:vAlign w:val="center"/>
-            <w:hideMark/>
-          </w:tcPr>
-          <w:p>
-            <w:r>
-              <w:t xml:space="preserve">As an </w:t>
-            </w:r>
             <w:r>
               <w:rPr>
                 <w:b/>
                 <w:bCs/>
               </w:rPr>
-              <w:t>External Agent</w:t>
-            </w:r>
-            <w:r>
-              <w:t>, I want to input vessel details (ETA, Qty, B/L Quality) into a portal, so the terminal can track my "nearness" automatically.</w:t>
-            </w:r>
-          </w:p>
-        </w:tc>
-        <w:tc>
-          <w:tcPr>
-            <w:tcW w:w="0" w:type="auto"/>
-            <w:tcBorders>
-              <w:top w:val="single" w:sz="6" w:space="0" w:color="auto"/>
-              <w:left w:val="single" w:sz="6" w:space="0" w:color="auto"/>
-              <w:bottom w:val="single" w:sz="6" w:space="0" w:color="auto"/>
-              <w:right w:val="single" w:sz="6" w:space="0" w:color="auto"/>
-            </w:tcBorders>
-            <w:tcMar>
-              <w:top w:w="120" w:type="dxa"/>
-              <w:left w:w="180" w:type="dxa"/>
-              <w:bottom w:w="120" w:type="dxa"/>
+              <w:t>Allocation</w:t>
+            </w:r>
+          </w:p>
+        </w:tc>
+        <w:tc>
+          <w:tcPr>
+            <w:tcW w:w="0" w:type="auto"/>
+            <w:tcBorders>
+              <w:top w:val="single" w:sz="6" w:space="0" w:color="auto"/>
+              <w:left w:val="single" w:sz="6" w:space="0" w:color="auto"/>
+              <w:bottom w:val="single" w:sz="6" w:space="0" w:color="auto"/>
+              <w:right w:val="single" w:sz="6" w:space="0" w:color="auto"/>
+            </w:tcBorders>
+            <w:tcMar>
+              <w:top w:w="240" w:type="dxa"/>
+              <w:left w:w="0" w:type="dxa"/>
+              <w:bottom w:w="240" w:type="dxa"/>
               <w:right w:w="180" w:type="dxa"/>
             </w:tcMar>
             <w:vAlign w:val="center"/>
@@ -747,7 +1337,31 @@
           </w:tcPr>
           <w:p>
             <w:r>
-              <w:t>• Mandatory fields for Vessel ID, ETA, and CPO Grade.</w:t>
+              <w:t>As a Jetty Operator, I want to update vessel positions and ETB/ETA so that the berthing sequence is accurate.</w:t>
+            </w:r>
+          </w:p>
+        </w:tc>
+        <w:tc>
+          <w:tcPr>
+            <w:tcW w:w="0" w:type="auto"/>
+            <w:tcBorders>
+              <w:top w:val="single" w:sz="6" w:space="0" w:color="auto"/>
+              <w:left w:val="single" w:sz="6" w:space="0" w:color="auto"/>
+              <w:bottom w:val="single" w:sz="6" w:space="0" w:color="auto"/>
+              <w:right w:val="single" w:sz="6" w:space="0" w:color="auto"/>
+            </w:tcBorders>
+            <w:tcMar>
+              <w:top w:w="240" w:type="dxa"/>
+              <w:left w:w="0" w:type="dxa"/>
+              <w:bottom w:w="240" w:type="dxa"/>
+              <w:right w:w="0" w:type="dxa"/>
+            </w:tcMar>
+            <w:vAlign w:val="center"/>
+            <w:hideMark/>
+          </w:tcPr>
+          <w:p>
+            <w:r>
+              <w:t>• Log arrival update functionality.</w:t>
             </w:r>
           </w:p>
           <w:p>
@@ -757,7 +1371,7 @@
           </w:p>
           <w:p>
             <w:r>
-              <w:t>• Automated timestamp for nomination receipt.</w:t>
+              <w:t>• Set berthing sequence and jetty assignment.</w:t>
             </w:r>
           </w:p>
         </w:tc>
@@ -776,9 +1390,9 @@
               <w:right w:val="single" w:sz="6" w:space="0" w:color="auto"/>
             </w:tcBorders>
             <w:tcMar>
-              <w:top w:w="120" w:type="dxa"/>
-              <w:left w:w="180" w:type="dxa"/>
-              <w:bottom w:w="120" w:type="dxa"/>
+              <w:top w:w="240" w:type="dxa"/>
+              <w:left w:w="0" w:type="dxa"/>
+              <w:bottom w:w="240" w:type="dxa"/>
               <w:right w:w="180" w:type="dxa"/>
             </w:tcMar>
             <w:vAlign w:val="center"/>
@@ -800,67 +1414,37 @@
               <w:right w:val="single" w:sz="6" w:space="0" w:color="auto"/>
             </w:tcBorders>
             <w:tcMar>
-              <w:top w:w="120" w:type="dxa"/>
-              <w:left w:w="180" w:type="dxa"/>
-              <w:bottom w:w="120" w:type="dxa"/>
+              <w:top w:w="240" w:type="dxa"/>
+              <w:left w:w="0" w:type="dxa"/>
+              <w:bottom w:w="240" w:type="dxa"/>
               <w:right w:w="180" w:type="dxa"/>
             </w:tcMar>
             <w:vAlign w:val="center"/>
             <w:hideMark/>
           </w:tcPr>
           <w:p>
-            <w:r>
-              <w:t>Planning</w:t>
-            </w:r>
-          </w:p>
-        </w:tc>
-        <w:tc>
-          <w:tcPr>
-            <w:tcW w:w="0" w:type="auto"/>
-            <w:tcBorders>
-              <w:top w:val="single" w:sz="6" w:space="0" w:color="auto"/>
-              <w:left w:val="single" w:sz="6" w:space="0" w:color="auto"/>
-              <w:bottom w:val="single" w:sz="6" w:space="0" w:color="auto"/>
-              <w:right w:val="single" w:sz="6" w:space="0" w:color="auto"/>
-            </w:tcBorders>
-            <w:tcMar>
-              <w:top w:w="120" w:type="dxa"/>
-              <w:left w:w="180" w:type="dxa"/>
-              <w:bottom w:w="120" w:type="dxa"/>
-              <w:right w:w="180" w:type="dxa"/>
-            </w:tcMar>
-            <w:vAlign w:val="center"/>
-            <w:hideMark/>
-          </w:tcPr>
-          <w:p>
-            <w:r>
-              <w:t xml:space="preserve">As a </w:t>
-            </w:r>
             <w:r>
               <w:rPr>
                 <w:b/>
                 <w:bCs/>
               </w:rPr>
-              <w:t>PPIC Planner</w:t>
-            </w:r>
-            <w:r>
-              <w:t>, I want to see real-time shore tank levels next to vessel ETAs, so I can prioritize feedstock for the refinery.</w:t>
-            </w:r>
-          </w:p>
-        </w:tc>
-        <w:tc>
-          <w:tcPr>
-            <w:tcW w:w="0" w:type="auto"/>
-            <w:tcBorders>
-              <w:top w:val="single" w:sz="6" w:space="0" w:color="auto"/>
-              <w:left w:val="single" w:sz="6" w:space="0" w:color="auto"/>
-              <w:bottom w:val="single" w:sz="6" w:space="0" w:color="auto"/>
-              <w:right w:val="single" w:sz="6" w:space="0" w:color="auto"/>
-            </w:tcBorders>
-            <w:tcMar>
-              <w:top w:w="120" w:type="dxa"/>
-              <w:left w:w="180" w:type="dxa"/>
-              <w:bottom w:w="120" w:type="dxa"/>
+              <w:t>Docking (Timer)</w:t>
+            </w:r>
+          </w:p>
+        </w:tc>
+        <w:tc>
+          <w:tcPr>
+            <w:tcW w:w="0" w:type="auto"/>
+            <w:tcBorders>
+              <w:top w:val="single" w:sz="6" w:space="0" w:color="auto"/>
+              <w:left w:val="single" w:sz="6" w:space="0" w:color="auto"/>
+              <w:bottom w:val="single" w:sz="6" w:space="0" w:color="auto"/>
+              <w:right w:val="single" w:sz="6" w:space="0" w:color="auto"/>
+            </w:tcBorders>
+            <w:tcMar>
+              <w:top w:w="240" w:type="dxa"/>
+              <w:left w:w="0" w:type="dxa"/>
+              <w:bottom w:w="240" w:type="dxa"/>
               <w:right w:w="180" w:type="dxa"/>
             </w:tcMar>
             <w:vAlign w:val="center"/>
@@ -868,7 +1452,39 @@
           </w:tcPr>
           <w:p>
             <w:r>
-              <w:t>• Integration of Tank Farm "Sounding" data.</w:t>
+              <w:t>As a Jetty Operator, I want to start a timer upon docking so the system calculates the Estimated Completion.</w:t>
+            </w:r>
+          </w:p>
+        </w:tc>
+        <w:tc>
+          <w:tcPr>
+            <w:tcW w:w="0" w:type="auto"/>
+            <w:tcBorders>
+              <w:top w:val="single" w:sz="6" w:space="0" w:color="auto"/>
+              <w:left w:val="single" w:sz="6" w:space="0" w:color="auto"/>
+              <w:bottom w:val="single" w:sz="6" w:space="0" w:color="auto"/>
+              <w:right w:val="single" w:sz="6" w:space="0" w:color="auto"/>
+            </w:tcBorders>
+            <w:tcMar>
+              <w:top w:w="240" w:type="dxa"/>
+              <w:left w:w="0" w:type="dxa"/>
+              <w:bottom w:w="240" w:type="dxa"/>
+              <w:right w:w="0" w:type="dxa"/>
+            </w:tcMar>
+            <w:vAlign w:val="center"/>
+            <w:hideMark/>
+          </w:tcPr>
+          <w:p>
+            <w:r>
+              <w:t xml:space="preserve">• Timer </w:t>
+            </w:r>
+            <w:proofErr w:type="gramStart"/>
+            <w:r>
+              <w:t>start</w:t>
+            </w:r>
+            <w:proofErr w:type="gramEnd"/>
+            <w:r>
+              <w:t xml:space="preserve"> triggers SLA formula calculation.</w:t>
             </w:r>
           </w:p>
           <w:p>
@@ -878,8 +1494,7 @@
           </w:p>
           <w:p>
             <w:r>
-              <w:lastRenderedPageBreak/>
-              <w:t>• Drag-and-drop prioritization on the "Line-Up" board.</w:t>
+              <w:t>• Variables (Standard Rate, Buffer, S) are configurable.</w:t>
             </w:r>
           </w:p>
         </w:tc>
@@ -898,9 +1513,9 @@
               <w:right w:val="single" w:sz="6" w:space="0" w:color="auto"/>
             </w:tcBorders>
             <w:tcMar>
-              <w:top w:w="120" w:type="dxa"/>
-              <w:left w:w="180" w:type="dxa"/>
-              <w:bottom w:w="120" w:type="dxa"/>
+              <w:top w:w="240" w:type="dxa"/>
+              <w:left w:w="0" w:type="dxa"/>
+              <w:bottom w:w="240" w:type="dxa"/>
               <w:right w:w="180" w:type="dxa"/>
             </w:tcMar>
             <w:vAlign w:val="center"/>
@@ -908,7 +1523,6 @@
           </w:tcPr>
           <w:p>
             <w:r>
-              <w:lastRenderedPageBreak/>
               <w:t>4</w:t>
             </w:r>
           </w:p>
@@ -923,67 +1537,37 @@
               <w:right w:val="single" w:sz="6" w:space="0" w:color="auto"/>
             </w:tcBorders>
             <w:tcMar>
-              <w:top w:w="120" w:type="dxa"/>
-              <w:left w:w="180" w:type="dxa"/>
-              <w:bottom w:w="120" w:type="dxa"/>
+              <w:top w:w="240" w:type="dxa"/>
+              <w:left w:w="0" w:type="dxa"/>
+              <w:bottom w:w="240" w:type="dxa"/>
               <w:right w:w="180" w:type="dxa"/>
             </w:tcMar>
             <w:vAlign w:val="center"/>
             <w:hideMark/>
           </w:tcPr>
           <w:p>
-            <w:r>
-              <w:t>Operations</w:t>
-            </w:r>
-          </w:p>
-        </w:tc>
-        <w:tc>
-          <w:tcPr>
-            <w:tcW w:w="0" w:type="auto"/>
-            <w:tcBorders>
-              <w:top w:val="single" w:sz="6" w:space="0" w:color="auto"/>
-              <w:left w:val="single" w:sz="6" w:space="0" w:color="auto"/>
-              <w:bottom w:val="single" w:sz="6" w:space="0" w:color="auto"/>
-              <w:right w:val="single" w:sz="6" w:space="0" w:color="auto"/>
-            </w:tcBorders>
-            <w:tcMar>
-              <w:top w:w="120" w:type="dxa"/>
-              <w:left w:w="180" w:type="dxa"/>
-              <w:bottom w:w="120" w:type="dxa"/>
-              <w:right w:w="180" w:type="dxa"/>
-            </w:tcMar>
-            <w:vAlign w:val="center"/>
-            <w:hideMark/>
-          </w:tcPr>
-          <w:p>
-            <w:r>
-              <w:t xml:space="preserve">As a </w:t>
-            </w:r>
             <w:r>
               <w:rPr>
                 <w:b/>
                 <w:bCs/>
               </w:rPr>
-              <w:t>Jetty Team</w:t>
-            </w:r>
-            <w:r>
-              <w:t xml:space="preserve"> member, I want to log "Palka Cleaning" start and end times, so that the system can track operational bottlenecks.</w:t>
-            </w:r>
-          </w:p>
-        </w:tc>
-        <w:tc>
-          <w:tcPr>
-            <w:tcW w:w="0" w:type="auto"/>
-            <w:tcBorders>
-              <w:top w:val="single" w:sz="6" w:space="0" w:color="auto"/>
-              <w:left w:val="single" w:sz="6" w:space="0" w:color="auto"/>
-              <w:bottom w:val="single" w:sz="6" w:space="0" w:color="auto"/>
-              <w:right w:val="single" w:sz="6" w:space="0" w:color="auto"/>
-            </w:tcBorders>
-            <w:tcMar>
-              <w:top w:w="120" w:type="dxa"/>
-              <w:left w:w="180" w:type="dxa"/>
-              <w:bottom w:w="120" w:type="dxa"/>
+              <w:t>QC / Survey</w:t>
+            </w:r>
+          </w:p>
+        </w:tc>
+        <w:tc>
+          <w:tcPr>
+            <w:tcW w:w="0" w:type="auto"/>
+            <w:tcBorders>
+              <w:top w:val="single" w:sz="6" w:space="0" w:color="auto"/>
+              <w:left w:val="single" w:sz="6" w:space="0" w:color="auto"/>
+              <w:bottom w:val="single" w:sz="6" w:space="0" w:color="auto"/>
+              <w:right w:val="single" w:sz="6" w:space="0" w:color="auto"/>
+            </w:tcBorders>
+            <w:tcMar>
+              <w:top w:w="240" w:type="dxa"/>
+              <w:left w:w="0" w:type="dxa"/>
+              <w:bottom w:w="240" w:type="dxa"/>
               <w:right w:w="180" w:type="dxa"/>
             </w:tcMar>
             <w:vAlign w:val="center"/>
@@ -991,15 +1575,31 @@
           </w:tcPr>
           <w:p>
             <w:r>
-              <w:t xml:space="preserve">• Mobile-friendly input for each of the 15 </w:t>
-            </w:r>
-            <w:proofErr w:type="spellStart"/>
-            <w:r>
-              <w:t>palkas</w:t>
-            </w:r>
-            <w:proofErr w:type="spellEnd"/>
-            <w:r>
-              <w:t>.</w:t>
+              <w:t>As a QC Team member, I want to log survey results and upload documents so the Jetty team knows when to start work.</w:t>
+            </w:r>
+          </w:p>
+        </w:tc>
+        <w:tc>
+          <w:tcPr>
+            <w:tcW w:w="0" w:type="auto"/>
+            <w:tcBorders>
+              <w:top w:val="single" w:sz="6" w:space="0" w:color="auto"/>
+              <w:left w:val="single" w:sz="6" w:space="0" w:color="auto"/>
+              <w:bottom w:val="single" w:sz="6" w:space="0" w:color="auto"/>
+              <w:right w:val="single" w:sz="6" w:space="0" w:color="auto"/>
+            </w:tcBorders>
+            <w:tcMar>
+              <w:top w:w="240" w:type="dxa"/>
+              <w:left w:w="0" w:type="dxa"/>
+              <w:bottom w:w="240" w:type="dxa"/>
+              <w:right w:w="0" w:type="dxa"/>
+            </w:tcMar>
+            <w:vAlign w:val="center"/>
+            <w:hideMark/>
+          </w:tcPr>
+          <w:p>
+            <w:r>
+              <w:t>• Input field for survey status.</w:t>
             </w:r>
           </w:p>
           <w:p>
@@ -1009,7 +1609,7 @@
           </w:p>
           <w:p>
             <w:r>
-              <w:t>• Automated calculation of total cleaning duration.</w:t>
+              <w:t>• Mandatory document upload before next stage.</w:t>
             </w:r>
           </w:p>
         </w:tc>
@@ -1028,9 +1628,9 @@
               <w:right w:val="single" w:sz="6" w:space="0" w:color="auto"/>
             </w:tcBorders>
             <w:tcMar>
-              <w:top w:w="120" w:type="dxa"/>
-              <w:left w:w="180" w:type="dxa"/>
-              <w:bottom w:w="120" w:type="dxa"/>
+              <w:top w:w="240" w:type="dxa"/>
+              <w:left w:w="0" w:type="dxa"/>
+              <w:bottom w:w="240" w:type="dxa"/>
               <w:right w:w="180" w:type="dxa"/>
             </w:tcMar>
             <w:vAlign w:val="center"/>
@@ -1038,6 +1638,7 @@
           </w:tcPr>
           <w:p>
             <w:r>
+              <w:lastRenderedPageBreak/>
               <w:t>5</w:t>
             </w:r>
           </w:p>
@@ -1052,67 +1653,37 @@
               <w:right w:val="single" w:sz="6" w:space="0" w:color="auto"/>
             </w:tcBorders>
             <w:tcMar>
-              <w:top w:w="120" w:type="dxa"/>
-              <w:left w:w="180" w:type="dxa"/>
-              <w:bottom w:w="120" w:type="dxa"/>
+              <w:top w:w="240" w:type="dxa"/>
+              <w:left w:w="0" w:type="dxa"/>
+              <w:bottom w:w="240" w:type="dxa"/>
               <w:right w:w="180" w:type="dxa"/>
             </w:tcMar>
             <w:vAlign w:val="center"/>
             <w:hideMark/>
           </w:tcPr>
           <w:p>
-            <w:r>
-              <w:t>Quality</w:t>
-            </w:r>
-          </w:p>
-        </w:tc>
-        <w:tc>
-          <w:tcPr>
-            <w:tcW w:w="0" w:type="auto"/>
-            <w:tcBorders>
-              <w:top w:val="single" w:sz="6" w:space="0" w:color="auto"/>
-              <w:left w:val="single" w:sz="6" w:space="0" w:color="auto"/>
-              <w:bottom w:val="single" w:sz="6" w:space="0" w:color="auto"/>
-              <w:right w:val="single" w:sz="6" w:space="0" w:color="auto"/>
-            </w:tcBorders>
-            <w:tcMar>
-              <w:top w:w="120" w:type="dxa"/>
-              <w:left w:w="180" w:type="dxa"/>
-              <w:bottom w:w="120" w:type="dxa"/>
-              <w:right w:w="180" w:type="dxa"/>
-            </w:tcMar>
-            <w:vAlign w:val="center"/>
-            <w:hideMark/>
-          </w:tcPr>
-          <w:p>
-            <w:r>
-              <w:t xml:space="preserve">As a </w:t>
-            </w:r>
             <w:r>
               <w:rPr>
                 <w:b/>
                 <w:bCs/>
               </w:rPr>
-              <w:t>QC Analyst</w:t>
-            </w:r>
-            <w:r>
-              <w:t>, I want to upload CPO analysis (FFA, DOBI, IV) for each shipment, so that management can see quality degradation from load to discharge.</w:t>
-            </w:r>
-          </w:p>
-        </w:tc>
-        <w:tc>
-          <w:tcPr>
-            <w:tcW w:w="0" w:type="auto"/>
-            <w:tcBorders>
-              <w:top w:val="single" w:sz="6" w:space="0" w:color="auto"/>
-              <w:left w:val="single" w:sz="6" w:space="0" w:color="auto"/>
-              <w:bottom w:val="single" w:sz="6" w:space="0" w:color="auto"/>
-              <w:right w:val="single" w:sz="6" w:space="0" w:color="auto"/>
-            </w:tcBorders>
-            <w:tcMar>
-              <w:top w:w="120" w:type="dxa"/>
-              <w:left w:w="180" w:type="dxa"/>
-              <w:bottom w:w="120" w:type="dxa"/>
+              <w:t>Quantity Check</w:t>
+            </w:r>
+          </w:p>
+        </w:tc>
+        <w:tc>
+          <w:tcPr>
+            <w:tcW w:w="0" w:type="auto"/>
+            <w:tcBorders>
+              <w:top w:val="single" w:sz="6" w:space="0" w:color="auto"/>
+              <w:left w:val="single" w:sz="6" w:space="0" w:color="auto"/>
+              <w:bottom w:val="single" w:sz="6" w:space="0" w:color="auto"/>
+              <w:right w:val="single" w:sz="6" w:space="0" w:color="auto"/>
+            </w:tcBorders>
+            <w:tcMar>
+              <w:top w:w="240" w:type="dxa"/>
+              <w:left w:w="0" w:type="dxa"/>
+              <w:bottom w:w="240" w:type="dxa"/>
               <w:right w:w="180" w:type="dxa"/>
             </w:tcMar>
             <w:vAlign w:val="center"/>
@@ -1120,7 +1691,41 @@
           </w:tcPr>
           <w:p>
             <w:r>
-              <w:t>• Comparison view of "Loading Quality" vs. "Discharge Quality".</w:t>
+              <w:t>As a Tank Farm/Jetty Operator, I want to key in quantity results (sounding) so that loading progress is tracked.</w:t>
+            </w:r>
+          </w:p>
+        </w:tc>
+        <w:tc>
+          <w:tcPr>
+            <w:tcW w:w="0" w:type="auto"/>
+            <w:tcBorders>
+              <w:top w:val="single" w:sz="6" w:space="0" w:color="auto"/>
+              <w:left w:val="single" w:sz="6" w:space="0" w:color="auto"/>
+              <w:bottom w:val="single" w:sz="6" w:space="0" w:color="auto"/>
+              <w:right w:val="single" w:sz="6" w:space="0" w:color="auto"/>
+            </w:tcBorders>
+            <w:tcMar>
+              <w:top w:w="240" w:type="dxa"/>
+              <w:left w:w="0" w:type="dxa"/>
+              <w:bottom w:w="240" w:type="dxa"/>
+              <w:right w:w="0" w:type="dxa"/>
+            </w:tcMar>
+            <w:vAlign w:val="center"/>
+            <w:hideMark/>
+          </w:tcPr>
+          <w:p>
+            <w:r>
+              <w:t>• Entry for quantity check result.</w:t>
+            </w:r>
+          </w:p>
+          <w:p>
+            <w:r>
+              <w:br/>
+            </w:r>
+          </w:p>
+          <w:p>
+            <w:r>
+              <w:t>• Integrated into the Loading/Unloading flow.</w:t>
             </w:r>
           </w:p>
         </w:tc>
@@ -1139,9 +1744,9 @@
               <w:right w:val="single" w:sz="6" w:space="0" w:color="auto"/>
             </w:tcBorders>
             <w:tcMar>
-              <w:top w:w="120" w:type="dxa"/>
-              <w:left w:w="180" w:type="dxa"/>
-              <w:bottom w:w="120" w:type="dxa"/>
+              <w:top w:w="240" w:type="dxa"/>
+              <w:left w:w="0" w:type="dxa"/>
+              <w:bottom w:w="240" w:type="dxa"/>
               <w:right w:w="180" w:type="dxa"/>
             </w:tcMar>
             <w:vAlign w:val="center"/>
@@ -1163,77 +1768,152 @@
               <w:right w:val="single" w:sz="6" w:space="0" w:color="auto"/>
             </w:tcBorders>
             <w:tcMar>
-              <w:top w:w="120" w:type="dxa"/>
-              <w:left w:w="180" w:type="dxa"/>
-              <w:bottom w:w="120" w:type="dxa"/>
+              <w:top w:w="240" w:type="dxa"/>
+              <w:left w:w="0" w:type="dxa"/>
+              <w:bottom w:w="240" w:type="dxa"/>
               <w:right w:w="180" w:type="dxa"/>
             </w:tcMar>
             <w:vAlign w:val="center"/>
             <w:hideMark/>
           </w:tcPr>
           <w:p>
-            <w:r>
-              <w:t>Verification</w:t>
-            </w:r>
-          </w:p>
-        </w:tc>
-        <w:tc>
-          <w:tcPr>
-            <w:tcW w:w="0" w:type="auto"/>
-            <w:tcBorders>
-              <w:top w:val="single" w:sz="6" w:space="0" w:color="auto"/>
-              <w:left w:val="single" w:sz="6" w:space="0" w:color="auto"/>
-              <w:bottom w:val="single" w:sz="6" w:space="0" w:color="auto"/>
-              <w:right w:val="single" w:sz="6" w:space="0" w:color="auto"/>
-            </w:tcBorders>
-            <w:tcMar>
-              <w:top w:w="120" w:type="dxa"/>
-              <w:left w:w="180" w:type="dxa"/>
-              <w:bottom w:w="120" w:type="dxa"/>
-              <w:right w:w="180" w:type="dxa"/>
-            </w:tcMar>
-            <w:vAlign w:val="center"/>
-            <w:hideMark/>
-          </w:tcPr>
-          <w:p>
-            <w:r>
-              <w:t xml:space="preserve">As an </w:t>
-            </w:r>
             <w:r>
               <w:rPr>
                 <w:b/>
                 <w:bCs/>
               </w:rPr>
-              <w:t>External Surveyor</w:t>
-            </w:r>
-            <w:r>
-              <w:t xml:space="preserve">, I want to digitally sign the </w:t>
-            </w:r>
+              <w:t>Clearance &amp; Sign-off</w:t>
+            </w:r>
+          </w:p>
+        </w:tc>
+        <w:tc>
+          <w:tcPr>
+            <w:tcW w:w="0" w:type="auto"/>
+            <w:tcBorders>
+              <w:top w:val="single" w:sz="6" w:space="0" w:color="auto"/>
+              <w:left w:val="single" w:sz="6" w:space="0" w:color="auto"/>
+              <w:bottom w:val="single" w:sz="6" w:space="0" w:color="auto"/>
+              <w:right w:val="single" w:sz="6" w:space="0" w:color="auto"/>
+            </w:tcBorders>
+            <w:tcMar>
+              <w:top w:w="240" w:type="dxa"/>
+              <w:left w:w="0" w:type="dxa"/>
+              <w:bottom w:w="240" w:type="dxa"/>
+              <w:right w:w="180" w:type="dxa"/>
+            </w:tcMar>
+            <w:vAlign w:val="center"/>
+            <w:hideMark/>
+          </w:tcPr>
+          <w:p>
+            <w:r>
+              <w:t>As a Jetty Operator, I want to sign off a vessel for sailing only when completion is 100%.</w:t>
+            </w:r>
+          </w:p>
+        </w:tc>
+        <w:tc>
+          <w:tcPr>
+            <w:tcW w:w="0" w:type="auto"/>
+            <w:tcBorders>
+              <w:top w:val="single" w:sz="6" w:space="0" w:color="auto"/>
+              <w:left w:val="single" w:sz="6" w:space="0" w:color="auto"/>
+              <w:bottom w:val="single" w:sz="6" w:space="0" w:color="auto"/>
+              <w:right w:val="single" w:sz="6" w:space="0" w:color="auto"/>
+            </w:tcBorders>
+            <w:tcMar>
+              <w:top w:w="240" w:type="dxa"/>
+              <w:left w:w="0" w:type="dxa"/>
+              <w:bottom w:w="240" w:type="dxa"/>
+              <w:right w:w="0" w:type="dxa"/>
+            </w:tcMar>
+            <w:vAlign w:val="center"/>
+            <w:hideMark/>
+          </w:tcPr>
+          <w:p>
+            <w:r>
+              <w:t>• Validation: 100% completion required for Sign-off.</w:t>
+            </w:r>
+          </w:p>
+          <w:p>
+            <w:r>
+              <w:br/>
+            </w:r>
+          </w:p>
+          <w:p>
+            <w:r>
+              <w:t>• Exception process requires justification &amp; admin approval.</w:t>
+            </w:r>
+          </w:p>
+        </w:tc>
+      </w:tr>
+      <w:tr>
+        <w:trPr>
+          <w:tblCellSpacing w:w="15" w:type="dxa"/>
+        </w:trPr>
+        <w:tc>
+          <w:tcPr>
+            <w:tcW w:w="0" w:type="auto"/>
+            <w:tcBorders>
+              <w:top w:val="single" w:sz="6" w:space="0" w:color="auto"/>
+              <w:left w:val="single" w:sz="6" w:space="0" w:color="auto"/>
+              <w:bottom w:val="single" w:sz="6" w:space="0" w:color="auto"/>
+              <w:right w:val="single" w:sz="6" w:space="0" w:color="auto"/>
+            </w:tcBorders>
+            <w:tcMar>
+              <w:top w:w="240" w:type="dxa"/>
+              <w:left w:w="0" w:type="dxa"/>
+              <w:bottom w:w="240" w:type="dxa"/>
+              <w:right w:w="180" w:type="dxa"/>
+            </w:tcMar>
+            <w:vAlign w:val="center"/>
+            <w:hideMark/>
+          </w:tcPr>
+          <w:p>
+            <w:r>
+              <w:t>7</w:t>
+            </w:r>
+          </w:p>
+        </w:tc>
+        <w:tc>
+          <w:tcPr>
+            <w:tcW w:w="0" w:type="auto"/>
+            <w:tcBorders>
+              <w:top w:val="single" w:sz="6" w:space="0" w:color="auto"/>
+              <w:left w:val="single" w:sz="6" w:space="0" w:color="auto"/>
+              <w:bottom w:val="single" w:sz="6" w:space="0" w:color="auto"/>
+              <w:right w:val="single" w:sz="6" w:space="0" w:color="auto"/>
+            </w:tcBorders>
+            <w:tcMar>
+              <w:top w:w="240" w:type="dxa"/>
+              <w:left w:w="0" w:type="dxa"/>
+              <w:bottom w:w="240" w:type="dxa"/>
+              <w:right w:w="180" w:type="dxa"/>
+            </w:tcMar>
+            <w:vAlign w:val="center"/>
+            <w:hideMark/>
+          </w:tcPr>
+          <w:p>
             <w:r>
               <w:rPr>
                 <w:b/>
                 <w:bCs/>
               </w:rPr>
-              <w:t>Dry Certificate</w:t>
-            </w:r>
-            <w:r>
-              <w:t>, so the vessel is officially cleared to sail only after the tanks are clean.</w:t>
-            </w:r>
-          </w:p>
-        </w:tc>
-        <w:tc>
-          <w:tcPr>
-            <w:tcW w:w="0" w:type="auto"/>
-            <w:tcBorders>
-              <w:top w:val="single" w:sz="6" w:space="0" w:color="auto"/>
-              <w:left w:val="single" w:sz="6" w:space="0" w:color="auto"/>
-              <w:bottom w:val="single" w:sz="6" w:space="0" w:color="auto"/>
-              <w:right w:val="single" w:sz="6" w:space="0" w:color="auto"/>
-            </w:tcBorders>
-            <w:tcMar>
-              <w:top w:w="120" w:type="dxa"/>
-              <w:left w:w="180" w:type="dxa"/>
-              <w:bottom w:w="120" w:type="dxa"/>
+              <w:t>Dashboard</w:t>
+            </w:r>
+          </w:p>
+        </w:tc>
+        <w:tc>
+          <w:tcPr>
+            <w:tcW w:w="0" w:type="auto"/>
+            <w:tcBorders>
+              <w:top w:val="single" w:sz="6" w:space="0" w:color="auto"/>
+              <w:left w:val="single" w:sz="6" w:space="0" w:color="auto"/>
+              <w:bottom w:val="single" w:sz="6" w:space="0" w:color="auto"/>
+              <w:right w:val="single" w:sz="6" w:space="0" w:color="auto"/>
+            </w:tcBorders>
+            <w:tcMar>
+              <w:top w:w="240" w:type="dxa"/>
+              <w:left w:w="0" w:type="dxa"/>
+              <w:bottom w:w="240" w:type="dxa"/>
               <w:right w:w="180" w:type="dxa"/>
             </w:tcMar>
             <w:vAlign w:val="center"/>
@@ -1241,12 +1921,627 @@
           </w:tcPr>
           <w:p>
             <w:r>
-              <w:t>• System lock preventing "Vessel Sailed" status until Dry Cert is marked "CLEAN".</w:t>
+              <w:t>As a Manager, I want to see weekly trends (occupied jetties, demurrage, incidents) and weather.</w:t>
+            </w:r>
+          </w:p>
+        </w:tc>
+        <w:tc>
+          <w:tcPr>
+            <w:tcW w:w="0" w:type="auto"/>
+            <w:tcBorders>
+              <w:top w:val="single" w:sz="6" w:space="0" w:color="auto"/>
+              <w:left w:val="single" w:sz="6" w:space="0" w:color="auto"/>
+              <w:bottom w:val="single" w:sz="6" w:space="0" w:color="auto"/>
+              <w:right w:val="single" w:sz="6" w:space="0" w:color="auto"/>
+            </w:tcBorders>
+            <w:tcMar>
+              <w:top w:w="240" w:type="dxa"/>
+              <w:left w:w="0" w:type="dxa"/>
+              <w:bottom w:w="240" w:type="dxa"/>
+              <w:right w:w="0" w:type="dxa"/>
+            </w:tcMar>
+            <w:vAlign w:val="center"/>
+            <w:hideMark/>
+          </w:tcPr>
+          <w:p>
+            <w:r>
+              <w:t>• Integration with Google Weather API.</w:t>
+            </w:r>
+          </w:p>
+          <w:p>
+            <w:r>
+              <w:br/>
+            </w:r>
+          </w:p>
+          <w:p>
+            <w:r>
+              <w:t>• Charts for Weekly trends (Incoming/Sailing/Demurrage).</w:t>
+            </w:r>
+          </w:p>
+        </w:tc>
+      </w:tr>
+      <w:tr>
+        <w:trPr>
+          <w:tblCellSpacing w:w="15" w:type="dxa"/>
+        </w:trPr>
+        <w:tc>
+          <w:tcPr>
+            <w:tcW w:w="0" w:type="auto"/>
+            <w:tcBorders>
+              <w:top w:val="single" w:sz="6" w:space="0" w:color="auto"/>
+              <w:left w:val="single" w:sz="6" w:space="0" w:color="auto"/>
+              <w:bottom w:val="single" w:sz="6" w:space="0" w:color="auto"/>
+              <w:right w:val="single" w:sz="6" w:space="0" w:color="auto"/>
+            </w:tcBorders>
+            <w:tcMar>
+              <w:top w:w="240" w:type="dxa"/>
+              <w:left w:w="0" w:type="dxa"/>
+              <w:bottom w:w="240" w:type="dxa"/>
+              <w:right w:w="180" w:type="dxa"/>
+            </w:tcMar>
+            <w:vAlign w:val="center"/>
+            <w:hideMark/>
+          </w:tcPr>
+          <w:p>
+            <w:r>
+              <w:t>8</w:t>
+            </w:r>
+          </w:p>
+        </w:tc>
+        <w:tc>
+          <w:tcPr>
+            <w:tcW w:w="0" w:type="auto"/>
+            <w:tcBorders>
+              <w:top w:val="single" w:sz="6" w:space="0" w:color="auto"/>
+              <w:left w:val="single" w:sz="6" w:space="0" w:color="auto"/>
+              <w:bottom w:val="single" w:sz="6" w:space="0" w:color="auto"/>
+              <w:right w:val="single" w:sz="6" w:space="0" w:color="auto"/>
+            </w:tcBorders>
+            <w:tcMar>
+              <w:top w:w="240" w:type="dxa"/>
+              <w:left w:w="0" w:type="dxa"/>
+              <w:bottom w:w="240" w:type="dxa"/>
+              <w:right w:w="180" w:type="dxa"/>
+            </w:tcMar>
+            <w:vAlign w:val="center"/>
+            <w:hideMark/>
+          </w:tcPr>
+          <w:p>
+            <w:r>
+              <w:rPr>
+                <w:b/>
+                <w:bCs/>
+              </w:rPr>
+              <w:t>Jetty Ops</w:t>
+            </w:r>
+          </w:p>
+        </w:tc>
+        <w:tc>
+          <w:tcPr>
+            <w:tcW w:w="0" w:type="auto"/>
+            <w:tcBorders>
+              <w:top w:val="single" w:sz="6" w:space="0" w:color="auto"/>
+              <w:left w:val="single" w:sz="6" w:space="0" w:color="auto"/>
+              <w:bottom w:val="single" w:sz="6" w:space="0" w:color="auto"/>
+              <w:right w:val="single" w:sz="6" w:space="0" w:color="auto"/>
+            </w:tcBorders>
+            <w:tcMar>
+              <w:top w:w="240" w:type="dxa"/>
+              <w:left w:w="0" w:type="dxa"/>
+              <w:bottom w:w="240" w:type="dxa"/>
+              <w:right w:w="180" w:type="dxa"/>
+            </w:tcMar>
+            <w:vAlign w:val="center"/>
+            <w:hideMark/>
+          </w:tcPr>
+          <w:p>
+            <w:r>
+              <w:t>As a Jetty Operator, I want to set jetty status (usable vs. downtime) so planning is realistic.</w:t>
+            </w:r>
+          </w:p>
+        </w:tc>
+        <w:tc>
+          <w:tcPr>
+            <w:tcW w:w="0" w:type="auto"/>
+            <w:tcBorders>
+              <w:top w:val="single" w:sz="6" w:space="0" w:color="auto"/>
+              <w:left w:val="single" w:sz="6" w:space="0" w:color="auto"/>
+              <w:bottom w:val="single" w:sz="6" w:space="0" w:color="auto"/>
+              <w:right w:val="single" w:sz="6" w:space="0" w:color="auto"/>
+            </w:tcBorders>
+            <w:tcMar>
+              <w:top w:w="240" w:type="dxa"/>
+              <w:left w:w="0" w:type="dxa"/>
+              <w:bottom w:w="240" w:type="dxa"/>
+              <w:right w:w="0" w:type="dxa"/>
+            </w:tcMar>
+            <w:vAlign w:val="center"/>
+            <w:hideMark/>
+          </w:tcPr>
+          <w:p>
+            <w:r>
+              <w:t>• Status toggle: Available, Maintenance, High-Priority Booking.</w:t>
             </w:r>
           </w:p>
         </w:tc>
       </w:tr>
     </w:tbl>
+    <w:p>
+      <w:r>
+        <w:pict w14:anchorId="70C4697B">
+          <v:rect id="_x0000_i1029" style="width:0;height:1.5pt" o:hralign="center" o:hrstd="t" o:hrnoshade="t" o:hr="t" fillcolor="gray" stroked="f"/>
+        </w:pict>
+      </w:r>
+    </w:p>
+    <w:p>
+      <w:pPr>
+        <w:rPr>
+          <w:b/>
+          <w:bCs/>
+        </w:rPr>
+      </w:pPr>
+      <w:r>
+        <w:rPr>
+          <w:b/>
+          <w:bCs/>
+        </w:rPr>
+        <w:t>7. Master Data &amp; Platform</w:t>
+      </w:r>
+    </w:p>
+    <w:tbl>
+      <w:tblPr>
+        <w:tblW w:w="0" w:type="auto"/>
+        <w:tblCellSpacing w:w="15" w:type="dxa"/>
+        <w:tblCellMar>
+          <w:left w:w="0" w:type="dxa"/>
+          <w:right w:w="0" w:type="dxa"/>
+        </w:tblCellMar>
+        <w:tblLook w:val="04A0" w:firstRow="1" w:lastRow="0" w:firstColumn="1" w:lastColumn="0" w:noHBand="0" w:noVBand="1"/>
+      </w:tblPr>
+      <w:tblGrid>
+        <w:gridCol w:w="563"/>
+        <w:gridCol w:w="1970"/>
+        <w:gridCol w:w="6811"/>
+      </w:tblGrid>
+      <w:tr>
+        <w:trPr>
+          <w:tblHeader/>
+          <w:tblCellSpacing w:w="15" w:type="dxa"/>
+        </w:trPr>
+        <w:tc>
+          <w:tcPr>
+            <w:tcW w:w="0" w:type="auto"/>
+            <w:tcBorders>
+              <w:top w:val="single" w:sz="6" w:space="0" w:color="auto"/>
+              <w:left w:val="single" w:sz="6" w:space="0" w:color="auto"/>
+              <w:bottom w:val="single" w:sz="6" w:space="0" w:color="auto"/>
+              <w:right w:val="single" w:sz="6" w:space="0" w:color="auto"/>
+            </w:tcBorders>
+            <w:tcMar>
+              <w:top w:w="240" w:type="dxa"/>
+              <w:left w:w="0" w:type="dxa"/>
+              <w:bottom w:w="240" w:type="dxa"/>
+              <w:right w:w="180" w:type="dxa"/>
+            </w:tcMar>
+            <w:vAlign w:val="center"/>
+            <w:hideMark/>
+          </w:tcPr>
+          <w:p>
+            <w:r>
+              <w:rPr>
+                <w:b/>
+                <w:bCs/>
+              </w:rPr>
+              <w:lastRenderedPageBreak/>
+              <w:t>No</w:t>
+            </w:r>
+          </w:p>
+        </w:tc>
+        <w:tc>
+          <w:tcPr>
+            <w:tcW w:w="0" w:type="auto"/>
+            <w:tcBorders>
+              <w:top w:val="single" w:sz="6" w:space="0" w:color="auto"/>
+              <w:left w:val="single" w:sz="6" w:space="0" w:color="auto"/>
+              <w:bottom w:val="single" w:sz="6" w:space="0" w:color="auto"/>
+              <w:right w:val="single" w:sz="6" w:space="0" w:color="auto"/>
+            </w:tcBorders>
+            <w:tcMar>
+              <w:top w:w="240" w:type="dxa"/>
+              <w:left w:w="0" w:type="dxa"/>
+              <w:bottom w:w="240" w:type="dxa"/>
+              <w:right w:w="180" w:type="dxa"/>
+            </w:tcMar>
+            <w:vAlign w:val="center"/>
+            <w:hideMark/>
+          </w:tcPr>
+          <w:p>
+            <w:r>
+              <w:rPr>
+                <w:b/>
+                <w:bCs/>
+              </w:rPr>
+              <w:t>Feature</w:t>
+            </w:r>
+          </w:p>
+        </w:tc>
+        <w:tc>
+          <w:tcPr>
+            <w:tcW w:w="0" w:type="auto"/>
+            <w:tcBorders>
+              <w:top w:val="single" w:sz="6" w:space="0" w:color="auto"/>
+              <w:left w:val="single" w:sz="6" w:space="0" w:color="auto"/>
+              <w:bottom w:val="single" w:sz="6" w:space="0" w:color="auto"/>
+              <w:right w:val="single" w:sz="6" w:space="0" w:color="auto"/>
+            </w:tcBorders>
+            <w:tcMar>
+              <w:top w:w="240" w:type="dxa"/>
+              <w:left w:w="0" w:type="dxa"/>
+              <w:bottom w:w="240" w:type="dxa"/>
+              <w:right w:w="0" w:type="dxa"/>
+            </w:tcMar>
+            <w:vAlign w:val="center"/>
+            <w:hideMark/>
+          </w:tcPr>
+          <w:p>
+            <w:r>
+              <w:rPr>
+                <w:b/>
+                <w:bCs/>
+              </w:rPr>
+              <w:t>Requirements</w:t>
+            </w:r>
+          </w:p>
+        </w:tc>
+      </w:tr>
+      <w:tr>
+        <w:trPr>
+          <w:tblCellSpacing w:w="15" w:type="dxa"/>
+        </w:trPr>
+        <w:tc>
+          <w:tcPr>
+            <w:tcW w:w="0" w:type="auto"/>
+            <w:tcBorders>
+              <w:top w:val="single" w:sz="6" w:space="0" w:color="auto"/>
+              <w:left w:val="single" w:sz="6" w:space="0" w:color="auto"/>
+              <w:bottom w:val="single" w:sz="6" w:space="0" w:color="auto"/>
+              <w:right w:val="single" w:sz="6" w:space="0" w:color="auto"/>
+            </w:tcBorders>
+            <w:tcMar>
+              <w:top w:w="240" w:type="dxa"/>
+              <w:left w:w="0" w:type="dxa"/>
+              <w:bottom w:w="240" w:type="dxa"/>
+              <w:right w:w="180" w:type="dxa"/>
+            </w:tcMar>
+            <w:vAlign w:val="center"/>
+            <w:hideMark/>
+          </w:tcPr>
+          <w:p>
+            <w:r>
+              <w:rPr>
+                <w:b/>
+                <w:bCs/>
+              </w:rPr>
+              <w:t>7.1</w:t>
+            </w:r>
+          </w:p>
+        </w:tc>
+        <w:tc>
+          <w:tcPr>
+            <w:tcW w:w="0" w:type="auto"/>
+            <w:tcBorders>
+              <w:top w:val="single" w:sz="6" w:space="0" w:color="auto"/>
+              <w:left w:val="single" w:sz="6" w:space="0" w:color="auto"/>
+              <w:bottom w:val="single" w:sz="6" w:space="0" w:color="auto"/>
+              <w:right w:val="single" w:sz="6" w:space="0" w:color="auto"/>
+            </w:tcBorders>
+            <w:tcMar>
+              <w:top w:w="240" w:type="dxa"/>
+              <w:left w:w="0" w:type="dxa"/>
+              <w:bottom w:w="240" w:type="dxa"/>
+              <w:right w:w="180" w:type="dxa"/>
+            </w:tcMar>
+            <w:vAlign w:val="center"/>
+            <w:hideMark/>
+          </w:tcPr>
+          <w:p>
+            <w:r>
+              <w:rPr>
+                <w:b/>
+                <w:bCs/>
+              </w:rPr>
+              <w:t>Port &amp; Jetty Master</w:t>
+            </w:r>
+          </w:p>
+        </w:tc>
+        <w:tc>
+          <w:tcPr>
+            <w:tcW w:w="0" w:type="auto"/>
+            <w:tcBorders>
+              <w:top w:val="single" w:sz="6" w:space="0" w:color="auto"/>
+              <w:left w:val="single" w:sz="6" w:space="0" w:color="auto"/>
+              <w:bottom w:val="single" w:sz="6" w:space="0" w:color="auto"/>
+              <w:right w:val="single" w:sz="6" w:space="0" w:color="auto"/>
+            </w:tcBorders>
+            <w:tcMar>
+              <w:top w:w="240" w:type="dxa"/>
+              <w:left w:w="0" w:type="dxa"/>
+              <w:bottom w:w="240" w:type="dxa"/>
+              <w:right w:w="0" w:type="dxa"/>
+            </w:tcMar>
+            <w:vAlign w:val="center"/>
+            <w:hideMark/>
+          </w:tcPr>
+          <w:p>
+            <w:r>
+              <w:t>Create master data for Sites and Jetty Specifications per Port.</w:t>
+            </w:r>
+          </w:p>
+        </w:tc>
+      </w:tr>
+      <w:tr>
+        <w:trPr>
+          <w:tblCellSpacing w:w="15" w:type="dxa"/>
+        </w:trPr>
+        <w:tc>
+          <w:tcPr>
+            <w:tcW w:w="0" w:type="auto"/>
+            <w:tcBorders>
+              <w:top w:val="single" w:sz="6" w:space="0" w:color="auto"/>
+              <w:left w:val="single" w:sz="6" w:space="0" w:color="auto"/>
+              <w:bottom w:val="single" w:sz="6" w:space="0" w:color="auto"/>
+              <w:right w:val="single" w:sz="6" w:space="0" w:color="auto"/>
+            </w:tcBorders>
+            <w:tcMar>
+              <w:top w:w="240" w:type="dxa"/>
+              <w:left w:w="0" w:type="dxa"/>
+              <w:bottom w:w="240" w:type="dxa"/>
+              <w:right w:w="180" w:type="dxa"/>
+            </w:tcMar>
+            <w:vAlign w:val="center"/>
+            <w:hideMark/>
+          </w:tcPr>
+          <w:p>
+            <w:r>
+              <w:rPr>
+                <w:b/>
+                <w:bCs/>
+              </w:rPr>
+              <w:t>7.2</w:t>
+            </w:r>
+          </w:p>
+        </w:tc>
+        <w:tc>
+          <w:tcPr>
+            <w:tcW w:w="0" w:type="auto"/>
+            <w:tcBorders>
+              <w:top w:val="single" w:sz="6" w:space="0" w:color="auto"/>
+              <w:left w:val="single" w:sz="6" w:space="0" w:color="auto"/>
+              <w:bottom w:val="single" w:sz="6" w:space="0" w:color="auto"/>
+              <w:right w:val="single" w:sz="6" w:space="0" w:color="auto"/>
+            </w:tcBorders>
+            <w:tcMar>
+              <w:top w:w="240" w:type="dxa"/>
+              <w:left w:w="0" w:type="dxa"/>
+              <w:bottom w:w="240" w:type="dxa"/>
+              <w:right w:w="180" w:type="dxa"/>
+            </w:tcMar>
+            <w:vAlign w:val="center"/>
+            <w:hideMark/>
+          </w:tcPr>
+          <w:p>
+            <w:r>
+              <w:rPr>
+                <w:b/>
+                <w:bCs/>
+              </w:rPr>
+              <w:t>SLA &amp; Rate Master</w:t>
+            </w:r>
+          </w:p>
+        </w:tc>
+        <w:tc>
+          <w:tcPr>
+            <w:tcW w:w="0" w:type="auto"/>
+            <w:tcBorders>
+              <w:top w:val="single" w:sz="6" w:space="0" w:color="auto"/>
+              <w:left w:val="single" w:sz="6" w:space="0" w:color="auto"/>
+              <w:bottom w:val="single" w:sz="6" w:space="0" w:color="auto"/>
+              <w:right w:val="single" w:sz="6" w:space="0" w:color="auto"/>
+            </w:tcBorders>
+            <w:tcMar>
+              <w:top w:w="240" w:type="dxa"/>
+              <w:left w:w="0" w:type="dxa"/>
+              <w:bottom w:w="240" w:type="dxa"/>
+              <w:right w:w="0" w:type="dxa"/>
+            </w:tcMar>
+            <w:vAlign w:val="center"/>
+            <w:hideMark/>
+          </w:tcPr>
+          <w:p>
+            <w:r>
+              <w:t>Define Standard Rates and Target KPIs for Loading/Unloading per material type.</w:t>
+            </w:r>
+          </w:p>
+        </w:tc>
+      </w:tr>
+      <w:tr>
+        <w:trPr>
+          <w:tblCellSpacing w:w="15" w:type="dxa"/>
+        </w:trPr>
+        <w:tc>
+          <w:tcPr>
+            <w:tcW w:w="0" w:type="auto"/>
+            <w:tcBorders>
+              <w:top w:val="single" w:sz="6" w:space="0" w:color="auto"/>
+              <w:left w:val="single" w:sz="6" w:space="0" w:color="auto"/>
+              <w:bottom w:val="single" w:sz="6" w:space="0" w:color="auto"/>
+              <w:right w:val="single" w:sz="6" w:space="0" w:color="auto"/>
+            </w:tcBorders>
+            <w:tcMar>
+              <w:top w:w="240" w:type="dxa"/>
+              <w:left w:w="0" w:type="dxa"/>
+              <w:bottom w:w="240" w:type="dxa"/>
+              <w:right w:w="180" w:type="dxa"/>
+            </w:tcMar>
+            <w:vAlign w:val="center"/>
+            <w:hideMark/>
+          </w:tcPr>
+          <w:p>
+            <w:r>
+              <w:rPr>
+                <w:b/>
+                <w:bCs/>
+              </w:rPr>
+              <w:t>7.3</w:t>
+            </w:r>
+          </w:p>
+        </w:tc>
+        <w:tc>
+          <w:tcPr>
+            <w:tcW w:w="0" w:type="auto"/>
+            <w:tcBorders>
+              <w:top w:val="single" w:sz="6" w:space="0" w:color="auto"/>
+              <w:left w:val="single" w:sz="6" w:space="0" w:color="auto"/>
+              <w:bottom w:val="single" w:sz="6" w:space="0" w:color="auto"/>
+              <w:right w:val="single" w:sz="6" w:space="0" w:color="auto"/>
+            </w:tcBorders>
+            <w:tcMar>
+              <w:top w:w="240" w:type="dxa"/>
+              <w:left w:w="0" w:type="dxa"/>
+              <w:bottom w:w="240" w:type="dxa"/>
+              <w:right w:w="180" w:type="dxa"/>
+            </w:tcMar>
+            <w:vAlign w:val="center"/>
+            <w:hideMark/>
+          </w:tcPr>
+          <w:p>
+            <w:r>
+              <w:rPr>
+                <w:b/>
+                <w:bCs/>
+              </w:rPr>
+              <w:t>RBAC</w:t>
+            </w:r>
+          </w:p>
+        </w:tc>
+        <w:tc>
+          <w:tcPr>
+            <w:tcW w:w="0" w:type="auto"/>
+            <w:tcBorders>
+              <w:top w:val="single" w:sz="6" w:space="0" w:color="auto"/>
+              <w:left w:val="single" w:sz="6" w:space="0" w:color="auto"/>
+              <w:bottom w:val="single" w:sz="6" w:space="0" w:color="auto"/>
+              <w:right w:val="single" w:sz="6" w:space="0" w:color="auto"/>
+            </w:tcBorders>
+            <w:tcMar>
+              <w:top w:w="240" w:type="dxa"/>
+              <w:left w:w="0" w:type="dxa"/>
+              <w:bottom w:w="240" w:type="dxa"/>
+              <w:right w:w="0" w:type="dxa"/>
+            </w:tcMar>
+            <w:vAlign w:val="center"/>
+            <w:hideMark/>
+          </w:tcPr>
+          <w:p>
+            <w:r>
+              <w:t>Permissions at Department, Page, and Field level (View/Edit/Delete).</w:t>
+            </w:r>
+          </w:p>
+        </w:tc>
+      </w:tr>
+      <w:tr>
+        <w:trPr>
+          <w:tblCellSpacing w:w="15" w:type="dxa"/>
+        </w:trPr>
+        <w:tc>
+          <w:tcPr>
+            <w:tcW w:w="0" w:type="auto"/>
+            <w:tcBorders>
+              <w:top w:val="single" w:sz="6" w:space="0" w:color="auto"/>
+              <w:left w:val="single" w:sz="6" w:space="0" w:color="auto"/>
+              <w:bottom w:val="single" w:sz="6" w:space="0" w:color="auto"/>
+              <w:right w:val="single" w:sz="6" w:space="0" w:color="auto"/>
+            </w:tcBorders>
+            <w:tcMar>
+              <w:top w:w="240" w:type="dxa"/>
+              <w:left w:w="0" w:type="dxa"/>
+              <w:bottom w:w="240" w:type="dxa"/>
+              <w:right w:w="180" w:type="dxa"/>
+            </w:tcMar>
+            <w:vAlign w:val="center"/>
+            <w:hideMark/>
+          </w:tcPr>
+          <w:p>
+            <w:r>
+              <w:rPr>
+                <w:b/>
+                <w:bCs/>
+              </w:rPr>
+              <w:t>7.4</w:t>
+            </w:r>
+          </w:p>
+        </w:tc>
+        <w:tc>
+          <w:tcPr>
+            <w:tcW w:w="0" w:type="auto"/>
+            <w:tcBorders>
+              <w:top w:val="single" w:sz="6" w:space="0" w:color="auto"/>
+              <w:left w:val="single" w:sz="6" w:space="0" w:color="auto"/>
+              <w:bottom w:val="single" w:sz="6" w:space="0" w:color="auto"/>
+              <w:right w:val="single" w:sz="6" w:space="0" w:color="auto"/>
+            </w:tcBorders>
+            <w:tcMar>
+              <w:top w:w="240" w:type="dxa"/>
+              <w:left w:w="0" w:type="dxa"/>
+              <w:bottom w:w="240" w:type="dxa"/>
+              <w:right w:w="180" w:type="dxa"/>
+            </w:tcMar>
+            <w:vAlign w:val="center"/>
+            <w:hideMark/>
+          </w:tcPr>
+          <w:p>
+            <w:r>
+              <w:rPr>
+                <w:b/>
+                <w:bCs/>
+              </w:rPr>
+              <w:t>Audit Trail</w:t>
+            </w:r>
+          </w:p>
+        </w:tc>
+        <w:tc>
+          <w:tcPr>
+            <w:tcW w:w="0" w:type="auto"/>
+            <w:tcBorders>
+              <w:top w:val="single" w:sz="6" w:space="0" w:color="auto"/>
+              <w:left w:val="single" w:sz="6" w:space="0" w:color="auto"/>
+              <w:bottom w:val="single" w:sz="6" w:space="0" w:color="auto"/>
+              <w:right w:val="single" w:sz="6" w:space="0" w:color="auto"/>
+            </w:tcBorders>
+            <w:tcMar>
+              <w:top w:w="240" w:type="dxa"/>
+              <w:left w:w="0" w:type="dxa"/>
+              <w:bottom w:w="240" w:type="dxa"/>
+              <w:right w:w="0" w:type="dxa"/>
+            </w:tcMar>
+            <w:vAlign w:val="center"/>
+            <w:hideMark/>
+          </w:tcPr>
+          <w:p>
+            <w:r>
+              <w:t>Full logging of every field change, status update, and user login.</w:t>
+            </w:r>
+          </w:p>
+        </w:tc>
+      </w:tr>
+    </w:tbl>
+    <w:p>
+      <w:r>
+        <w:pict w14:anchorId="3A0F80B4">
+          <v:rect id="_x0000_i1030" style="width:0;height:1.5pt" o:hralign="center" o:hrstd="t" o:hrnoshade="t" o:hr="t" fillcolor="gray" stroked="f"/>
+        </w:pict>
+      </w:r>
+    </w:p>
     <w:p>
       <w:pPr>
         <w:rPr>
@@ -1262,60 +2557,646 @@
         <w:t>8. Dependencies / Risks</w:t>
       </w:r>
     </w:p>
-    <w:p>
-      <w:pPr>
-        <w:numPr>
-          <w:ilvl w:val="0"/>
-          <w:numId w:val="5"/>
-        </w:numPr>
-      </w:pPr>
-      <w:r>
-        <w:rPr>
-          <w:b/>
-          <w:bCs/>
-        </w:rPr>
-        <w:t>Dependency:</w:t>
-      </w:r>
-      <w:r>
-        <w:t xml:space="preserve"> Accurate AIS data for real-time tracking.</w:t>
-      </w:r>
-    </w:p>
-    <w:p>
-      <w:pPr>
-        <w:numPr>
-          <w:ilvl w:val="0"/>
-          <w:numId w:val="5"/>
-        </w:numPr>
-      </w:pPr>
-      <w:r>
-        <w:rPr>
-          <w:b/>
-          <w:bCs/>
-        </w:rPr>
-        <w:t>Risk:</w:t>
-      </w:r>
-      <w:r>
-        <w:t xml:space="preserve"> Low adoption from external agents/surveyors accustomed to paper.</w:t>
-      </w:r>
-    </w:p>
-    <w:p>
-      <w:pPr>
-        <w:numPr>
-          <w:ilvl w:val="0"/>
-          <w:numId w:val="5"/>
-        </w:numPr>
-      </w:pPr>
-      <w:r>
-        <w:rPr>
-          <w:b/>
-          <w:bCs/>
-        </w:rPr>
-        <w:t>Mitigation:</w:t>
-      </w:r>
-      <w:r>
-        <w:t xml:space="preserve"> Provide a simplified mobile portal for external partners with automated PDF generation.</w:t>
-      </w:r>
-    </w:p>
+    <w:tbl>
+      <w:tblPr>
+        <w:tblW w:w="0" w:type="auto"/>
+        <w:tblCellSpacing w:w="15" w:type="dxa"/>
+        <w:tblCellMar>
+          <w:left w:w="0" w:type="dxa"/>
+          <w:right w:w="0" w:type="dxa"/>
+        </w:tblCellMar>
+        <w:tblLook w:val="04A0" w:firstRow="1" w:lastRow="0" w:firstColumn="1" w:lastColumn="0" w:noHBand="0" w:noVBand="1"/>
+      </w:tblPr>
+      <w:tblGrid>
+        <w:gridCol w:w="544"/>
+        <w:gridCol w:w="1903"/>
+        <w:gridCol w:w="1407"/>
+        <w:gridCol w:w="4005"/>
+        <w:gridCol w:w="791"/>
+        <w:gridCol w:w="694"/>
+      </w:tblGrid>
+      <w:tr>
+        <w:trPr>
+          <w:tblHeader/>
+          <w:tblCellSpacing w:w="15" w:type="dxa"/>
+        </w:trPr>
+        <w:tc>
+          <w:tcPr>
+            <w:tcW w:w="0" w:type="auto"/>
+            <w:tcBorders>
+              <w:top w:val="single" w:sz="6" w:space="0" w:color="auto"/>
+              <w:left w:val="single" w:sz="6" w:space="0" w:color="auto"/>
+              <w:bottom w:val="single" w:sz="6" w:space="0" w:color="auto"/>
+              <w:right w:val="single" w:sz="6" w:space="0" w:color="auto"/>
+            </w:tcBorders>
+            <w:tcMar>
+              <w:top w:w="240" w:type="dxa"/>
+              <w:left w:w="0" w:type="dxa"/>
+              <w:bottom w:w="240" w:type="dxa"/>
+              <w:right w:w="180" w:type="dxa"/>
+            </w:tcMar>
+            <w:vAlign w:val="center"/>
+            <w:hideMark/>
+          </w:tcPr>
+          <w:p>
+            <w:r>
+              <w:rPr>
+                <w:b/>
+                <w:bCs/>
+              </w:rPr>
+              <w:t>No</w:t>
+            </w:r>
+          </w:p>
+        </w:tc>
+        <w:tc>
+          <w:tcPr>
+            <w:tcW w:w="0" w:type="auto"/>
+            <w:tcBorders>
+              <w:top w:val="single" w:sz="6" w:space="0" w:color="auto"/>
+              <w:left w:val="single" w:sz="6" w:space="0" w:color="auto"/>
+              <w:bottom w:val="single" w:sz="6" w:space="0" w:color="auto"/>
+              <w:right w:val="single" w:sz="6" w:space="0" w:color="auto"/>
+            </w:tcBorders>
+            <w:tcMar>
+              <w:top w:w="240" w:type="dxa"/>
+              <w:left w:w="0" w:type="dxa"/>
+              <w:bottom w:w="240" w:type="dxa"/>
+              <w:right w:w="180" w:type="dxa"/>
+            </w:tcMar>
+            <w:vAlign w:val="center"/>
+            <w:hideMark/>
+          </w:tcPr>
+          <w:p>
+            <w:r>
+              <w:rPr>
+                <w:b/>
+                <w:bCs/>
+              </w:rPr>
+              <w:t>Dependency / Risk</w:t>
+            </w:r>
+          </w:p>
+        </w:tc>
+        <w:tc>
+          <w:tcPr>
+            <w:tcW w:w="0" w:type="auto"/>
+            <w:tcBorders>
+              <w:top w:val="single" w:sz="6" w:space="0" w:color="auto"/>
+              <w:left w:val="single" w:sz="6" w:space="0" w:color="auto"/>
+              <w:bottom w:val="single" w:sz="6" w:space="0" w:color="auto"/>
+              <w:right w:val="single" w:sz="6" w:space="0" w:color="auto"/>
+            </w:tcBorders>
+            <w:tcMar>
+              <w:top w:w="240" w:type="dxa"/>
+              <w:left w:w="0" w:type="dxa"/>
+              <w:bottom w:w="240" w:type="dxa"/>
+              <w:right w:w="180" w:type="dxa"/>
+            </w:tcMar>
+            <w:vAlign w:val="center"/>
+            <w:hideMark/>
+          </w:tcPr>
+          <w:p>
+            <w:r>
+              <w:rPr>
+                <w:b/>
+                <w:bCs/>
+              </w:rPr>
+              <w:t>Raised Date</w:t>
+            </w:r>
+          </w:p>
+        </w:tc>
+        <w:tc>
+          <w:tcPr>
+            <w:tcW w:w="0" w:type="auto"/>
+            <w:tcBorders>
+              <w:top w:val="single" w:sz="6" w:space="0" w:color="auto"/>
+              <w:left w:val="single" w:sz="6" w:space="0" w:color="auto"/>
+              <w:bottom w:val="single" w:sz="6" w:space="0" w:color="auto"/>
+              <w:right w:val="single" w:sz="6" w:space="0" w:color="auto"/>
+            </w:tcBorders>
+            <w:tcMar>
+              <w:top w:w="240" w:type="dxa"/>
+              <w:left w:w="0" w:type="dxa"/>
+              <w:bottom w:w="240" w:type="dxa"/>
+              <w:right w:w="180" w:type="dxa"/>
+            </w:tcMar>
+            <w:vAlign w:val="center"/>
+            <w:hideMark/>
+          </w:tcPr>
+          <w:p>
+            <w:r>
+              <w:rPr>
+                <w:b/>
+                <w:bCs/>
+              </w:rPr>
+              <w:t>Mitigation</w:t>
+            </w:r>
+          </w:p>
+        </w:tc>
+        <w:tc>
+          <w:tcPr>
+            <w:tcW w:w="0" w:type="auto"/>
+            <w:tcBorders>
+              <w:top w:val="single" w:sz="6" w:space="0" w:color="auto"/>
+              <w:left w:val="single" w:sz="6" w:space="0" w:color="auto"/>
+              <w:bottom w:val="single" w:sz="6" w:space="0" w:color="auto"/>
+              <w:right w:val="single" w:sz="6" w:space="0" w:color="auto"/>
+            </w:tcBorders>
+            <w:tcMar>
+              <w:top w:w="240" w:type="dxa"/>
+              <w:left w:w="0" w:type="dxa"/>
+              <w:bottom w:w="240" w:type="dxa"/>
+              <w:right w:w="180" w:type="dxa"/>
+            </w:tcMar>
+            <w:vAlign w:val="center"/>
+            <w:hideMark/>
+          </w:tcPr>
+          <w:p>
+            <w:r>
+              <w:rPr>
+                <w:b/>
+                <w:bCs/>
+              </w:rPr>
+              <w:t>PIC</w:t>
+            </w:r>
+          </w:p>
+        </w:tc>
+        <w:tc>
+          <w:tcPr>
+            <w:tcW w:w="0" w:type="auto"/>
+            <w:tcBorders>
+              <w:top w:val="single" w:sz="6" w:space="0" w:color="auto"/>
+              <w:left w:val="single" w:sz="6" w:space="0" w:color="auto"/>
+              <w:bottom w:val="single" w:sz="6" w:space="0" w:color="auto"/>
+              <w:right w:val="single" w:sz="6" w:space="0" w:color="auto"/>
+            </w:tcBorders>
+            <w:tcMar>
+              <w:top w:w="240" w:type="dxa"/>
+              <w:left w:w="0" w:type="dxa"/>
+              <w:bottom w:w="240" w:type="dxa"/>
+              <w:right w:w="0" w:type="dxa"/>
+            </w:tcMar>
+            <w:vAlign w:val="center"/>
+            <w:hideMark/>
+          </w:tcPr>
+          <w:p>
+            <w:r>
+              <w:rPr>
+                <w:b/>
+                <w:bCs/>
+              </w:rPr>
+              <w:t>Status</w:t>
+            </w:r>
+          </w:p>
+        </w:tc>
+      </w:tr>
+      <w:tr>
+        <w:trPr>
+          <w:tblCellSpacing w:w="15" w:type="dxa"/>
+        </w:trPr>
+        <w:tc>
+          <w:tcPr>
+            <w:tcW w:w="0" w:type="auto"/>
+            <w:tcBorders>
+              <w:top w:val="single" w:sz="6" w:space="0" w:color="auto"/>
+              <w:left w:val="single" w:sz="6" w:space="0" w:color="auto"/>
+              <w:bottom w:val="single" w:sz="6" w:space="0" w:color="auto"/>
+              <w:right w:val="single" w:sz="6" w:space="0" w:color="auto"/>
+            </w:tcBorders>
+            <w:tcMar>
+              <w:top w:w="240" w:type="dxa"/>
+              <w:left w:w="0" w:type="dxa"/>
+              <w:bottom w:w="240" w:type="dxa"/>
+              <w:right w:w="180" w:type="dxa"/>
+            </w:tcMar>
+            <w:vAlign w:val="center"/>
+            <w:hideMark/>
+          </w:tcPr>
+          <w:p>
+            <w:r>
+              <w:t>1</w:t>
+            </w:r>
+          </w:p>
+        </w:tc>
+        <w:tc>
+          <w:tcPr>
+            <w:tcW w:w="0" w:type="auto"/>
+            <w:tcBorders>
+              <w:top w:val="single" w:sz="6" w:space="0" w:color="auto"/>
+              <w:left w:val="single" w:sz="6" w:space="0" w:color="auto"/>
+              <w:bottom w:val="single" w:sz="6" w:space="0" w:color="auto"/>
+              <w:right w:val="single" w:sz="6" w:space="0" w:color="auto"/>
+            </w:tcBorders>
+            <w:tcMar>
+              <w:top w:w="240" w:type="dxa"/>
+              <w:left w:w="0" w:type="dxa"/>
+              <w:bottom w:w="240" w:type="dxa"/>
+              <w:right w:w="180" w:type="dxa"/>
+            </w:tcMar>
+            <w:vAlign w:val="center"/>
+            <w:hideMark/>
+          </w:tcPr>
+          <w:p>
+            <w:r>
+              <w:t>Data Stream Integration</w:t>
+            </w:r>
+          </w:p>
+        </w:tc>
+        <w:tc>
+          <w:tcPr>
+            <w:tcW w:w="0" w:type="auto"/>
+            <w:tcBorders>
+              <w:top w:val="single" w:sz="6" w:space="0" w:color="auto"/>
+              <w:left w:val="single" w:sz="6" w:space="0" w:color="auto"/>
+              <w:bottom w:val="single" w:sz="6" w:space="0" w:color="auto"/>
+              <w:right w:val="single" w:sz="6" w:space="0" w:color="auto"/>
+            </w:tcBorders>
+            <w:tcMar>
+              <w:top w:w="240" w:type="dxa"/>
+              <w:left w:w="0" w:type="dxa"/>
+              <w:bottom w:w="240" w:type="dxa"/>
+              <w:right w:w="180" w:type="dxa"/>
+            </w:tcMar>
+            <w:vAlign w:val="center"/>
+            <w:hideMark/>
+          </w:tcPr>
+          <w:p>
+            <w:r>
+              <w:t>09/03/2026</w:t>
+            </w:r>
+          </w:p>
+        </w:tc>
+        <w:tc>
+          <w:tcPr>
+            <w:tcW w:w="0" w:type="auto"/>
+            <w:tcBorders>
+              <w:top w:val="single" w:sz="6" w:space="0" w:color="auto"/>
+              <w:left w:val="single" w:sz="6" w:space="0" w:color="auto"/>
+              <w:bottom w:val="single" w:sz="6" w:space="0" w:color="auto"/>
+              <w:right w:val="single" w:sz="6" w:space="0" w:color="auto"/>
+            </w:tcBorders>
+            <w:tcMar>
+              <w:top w:w="240" w:type="dxa"/>
+              <w:left w:w="0" w:type="dxa"/>
+              <w:bottom w:w="240" w:type="dxa"/>
+              <w:right w:w="180" w:type="dxa"/>
+            </w:tcMar>
+            <w:vAlign w:val="center"/>
+            <w:hideMark/>
+          </w:tcPr>
+          <w:p>
+            <w:r>
+              <w:t>Ensure EXIM/Logistics data format matches Jetty SI requirements.</w:t>
+            </w:r>
+          </w:p>
+        </w:tc>
+        <w:tc>
+          <w:tcPr>
+            <w:tcW w:w="0" w:type="auto"/>
+            <w:tcBorders>
+              <w:top w:val="single" w:sz="6" w:space="0" w:color="auto"/>
+              <w:left w:val="single" w:sz="6" w:space="0" w:color="auto"/>
+              <w:bottom w:val="single" w:sz="6" w:space="0" w:color="auto"/>
+              <w:right w:val="single" w:sz="6" w:space="0" w:color="auto"/>
+            </w:tcBorders>
+            <w:tcMar>
+              <w:top w:w="240" w:type="dxa"/>
+              <w:left w:w="0" w:type="dxa"/>
+              <w:bottom w:w="240" w:type="dxa"/>
+              <w:right w:w="180" w:type="dxa"/>
+            </w:tcMar>
+            <w:vAlign w:val="center"/>
+            <w:hideMark/>
+          </w:tcPr>
+          <w:p>
+            <w:r>
+              <w:t>IT Lead</w:t>
+            </w:r>
+          </w:p>
+        </w:tc>
+        <w:tc>
+          <w:tcPr>
+            <w:tcW w:w="0" w:type="auto"/>
+            <w:tcBorders>
+              <w:top w:val="single" w:sz="6" w:space="0" w:color="auto"/>
+              <w:left w:val="single" w:sz="6" w:space="0" w:color="auto"/>
+              <w:bottom w:val="single" w:sz="6" w:space="0" w:color="auto"/>
+              <w:right w:val="single" w:sz="6" w:space="0" w:color="auto"/>
+            </w:tcBorders>
+            <w:tcMar>
+              <w:top w:w="240" w:type="dxa"/>
+              <w:left w:w="0" w:type="dxa"/>
+              <w:bottom w:w="240" w:type="dxa"/>
+              <w:right w:w="0" w:type="dxa"/>
+            </w:tcMar>
+            <w:vAlign w:val="center"/>
+            <w:hideMark/>
+          </w:tcPr>
+          <w:p>
+            <w:r>
+              <w:t>Open</w:t>
+            </w:r>
+          </w:p>
+        </w:tc>
+      </w:tr>
+      <w:tr>
+        <w:trPr>
+          <w:tblCellSpacing w:w="15" w:type="dxa"/>
+        </w:trPr>
+        <w:tc>
+          <w:tcPr>
+            <w:tcW w:w="0" w:type="auto"/>
+            <w:tcBorders>
+              <w:top w:val="single" w:sz="6" w:space="0" w:color="auto"/>
+              <w:left w:val="single" w:sz="6" w:space="0" w:color="auto"/>
+              <w:bottom w:val="single" w:sz="6" w:space="0" w:color="auto"/>
+              <w:right w:val="single" w:sz="6" w:space="0" w:color="auto"/>
+            </w:tcBorders>
+            <w:tcMar>
+              <w:top w:w="240" w:type="dxa"/>
+              <w:left w:w="0" w:type="dxa"/>
+              <w:bottom w:w="240" w:type="dxa"/>
+              <w:right w:w="180" w:type="dxa"/>
+            </w:tcMar>
+            <w:vAlign w:val="center"/>
+            <w:hideMark/>
+          </w:tcPr>
+          <w:p>
+            <w:r>
+              <w:t>2</w:t>
+            </w:r>
+          </w:p>
+        </w:tc>
+        <w:tc>
+          <w:tcPr>
+            <w:tcW w:w="0" w:type="auto"/>
+            <w:tcBorders>
+              <w:top w:val="single" w:sz="6" w:space="0" w:color="auto"/>
+              <w:left w:val="single" w:sz="6" w:space="0" w:color="auto"/>
+              <w:bottom w:val="single" w:sz="6" w:space="0" w:color="auto"/>
+              <w:right w:val="single" w:sz="6" w:space="0" w:color="auto"/>
+            </w:tcBorders>
+            <w:tcMar>
+              <w:top w:w="240" w:type="dxa"/>
+              <w:left w:w="0" w:type="dxa"/>
+              <w:bottom w:w="240" w:type="dxa"/>
+              <w:right w:w="180" w:type="dxa"/>
+            </w:tcMar>
+            <w:vAlign w:val="center"/>
+            <w:hideMark/>
+          </w:tcPr>
+          <w:p>
+            <w:r>
+              <w:t>Formula Accuracy</w:t>
+            </w:r>
+          </w:p>
+        </w:tc>
+        <w:tc>
+          <w:tcPr>
+            <w:tcW w:w="0" w:type="auto"/>
+            <w:tcBorders>
+              <w:top w:val="single" w:sz="6" w:space="0" w:color="auto"/>
+              <w:left w:val="single" w:sz="6" w:space="0" w:color="auto"/>
+              <w:bottom w:val="single" w:sz="6" w:space="0" w:color="auto"/>
+              <w:right w:val="single" w:sz="6" w:space="0" w:color="auto"/>
+            </w:tcBorders>
+            <w:tcMar>
+              <w:top w:w="240" w:type="dxa"/>
+              <w:left w:w="0" w:type="dxa"/>
+              <w:bottom w:w="240" w:type="dxa"/>
+              <w:right w:w="180" w:type="dxa"/>
+            </w:tcMar>
+            <w:vAlign w:val="center"/>
+            <w:hideMark/>
+          </w:tcPr>
+          <w:p>
+            <w:r>
+              <w:t>09/03/2026</w:t>
+            </w:r>
+          </w:p>
+        </w:tc>
+        <w:tc>
+          <w:tcPr>
+            <w:tcW w:w="0" w:type="auto"/>
+            <w:tcBorders>
+              <w:top w:val="single" w:sz="6" w:space="0" w:color="auto"/>
+              <w:left w:val="single" w:sz="6" w:space="0" w:color="auto"/>
+              <w:bottom w:val="single" w:sz="6" w:space="0" w:color="auto"/>
+              <w:right w:val="single" w:sz="6" w:space="0" w:color="auto"/>
+            </w:tcBorders>
+            <w:tcMar>
+              <w:top w:w="240" w:type="dxa"/>
+              <w:left w:w="0" w:type="dxa"/>
+              <w:bottom w:w="240" w:type="dxa"/>
+              <w:right w:w="180" w:type="dxa"/>
+            </w:tcMar>
+            <w:vAlign w:val="center"/>
+            <w:hideMark/>
+          </w:tcPr>
+          <w:p>
+            <w:r>
+              <w:t>Test SLA formula with historical data to calibrate "Buffer" defaults.</w:t>
+            </w:r>
+          </w:p>
+        </w:tc>
+        <w:tc>
+          <w:tcPr>
+            <w:tcW w:w="0" w:type="auto"/>
+            <w:tcBorders>
+              <w:top w:val="single" w:sz="6" w:space="0" w:color="auto"/>
+              <w:left w:val="single" w:sz="6" w:space="0" w:color="auto"/>
+              <w:bottom w:val="single" w:sz="6" w:space="0" w:color="auto"/>
+              <w:right w:val="single" w:sz="6" w:space="0" w:color="auto"/>
+            </w:tcBorders>
+            <w:tcMar>
+              <w:top w:w="240" w:type="dxa"/>
+              <w:left w:w="0" w:type="dxa"/>
+              <w:bottom w:w="240" w:type="dxa"/>
+              <w:right w:w="180" w:type="dxa"/>
+            </w:tcMar>
+            <w:vAlign w:val="center"/>
+            <w:hideMark/>
+          </w:tcPr>
+          <w:p>
+            <w:r>
+              <w:t>PPIC</w:t>
+            </w:r>
+          </w:p>
+        </w:tc>
+        <w:tc>
+          <w:tcPr>
+            <w:tcW w:w="0" w:type="auto"/>
+            <w:tcBorders>
+              <w:top w:val="single" w:sz="6" w:space="0" w:color="auto"/>
+              <w:left w:val="single" w:sz="6" w:space="0" w:color="auto"/>
+              <w:bottom w:val="single" w:sz="6" w:space="0" w:color="auto"/>
+              <w:right w:val="single" w:sz="6" w:space="0" w:color="auto"/>
+            </w:tcBorders>
+            <w:tcMar>
+              <w:top w:w="240" w:type="dxa"/>
+              <w:left w:w="0" w:type="dxa"/>
+              <w:bottom w:w="240" w:type="dxa"/>
+              <w:right w:w="0" w:type="dxa"/>
+            </w:tcMar>
+            <w:vAlign w:val="center"/>
+            <w:hideMark/>
+          </w:tcPr>
+          <w:p>
+            <w:r>
+              <w:t>Open</w:t>
+            </w:r>
+          </w:p>
+        </w:tc>
+      </w:tr>
+      <w:tr>
+        <w:trPr>
+          <w:tblCellSpacing w:w="15" w:type="dxa"/>
+        </w:trPr>
+        <w:tc>
+          <w:tcPr>
+            <w:tcW w:w="0" w:type="auto"/>
+            <w:tcBorders>
+              <w:top w:val="single" w:sz="6" w:space="0" w:color="auto"/>
+              <w:left w:val="single" w:sz="6" w:space="0" w:color="auto"/>
+              <w:bottom w:val="single" w:sz="6" w:space="0" w:color="auto"/>
+              <w:right w:val="single" w:sz="6" w:space="0" w:color="auto"/>
+            </w:tcBorders>
+            <w:tcMar>
+              <w:top w:w="240" w:type="dxa"/>
+              <w:left w:w="0" w:type="dxa"/>
+              <w:bottom w:w="240" w:type="dxa"/>
+              <w:right w:w="180" w:type="dxa"/>
+            </w:tcMar>
+            <w:vAlign w:val="center"/>
+            <w:hideMark/>
+          </w:tcPr>
+          <w:p>
+            <w:r>
+              <w:t>3</w:t>
+            </w:r>
+          </w:p>
+        </w:tc>
+        <w:tc>
+          <w:tcPr>
+            <w:tcW w:w="0" w:type="auto"/>
+            <w:tcBorders>
+              <w:top w:val="single" w:sz="6" w:space="0" w:color="auto"/>
+              <w:left w:val="single" w:sz="6" w:space="0" w:color="auto"/>
+              <w:bottom w:val="single" w:sz="6" w:space="0" w:color="auto"/>
+              <w:right w:val="single" w:sz="6" w:space="0" w:color="auto"/>
+            </w:tcBorders>
+            <w:tcMar>
+              <w:top w:w="240" w:type="dxa"/>
+              <w:left w:w="0" w:type="dxa"/>
+              <w:bottom w:w="240" w:type="dxa"/>
+              <w:right w:w="180" w:type="dxa"/>
+            </w:tcMar>
+            <w:vAlign w:val="center"/>
+            <w:hideMark/>
+          </w:tcPr>
+          <w:p>
+            <w:r>
+              <w:t>Connectivity</w:t>
+            </w:r>
+          </w:p>
+        </w:tc>
+        <w:tc>
+          <w:tcPr>
+            <w:tcW w:w="0" w:type="auto"/>
+            <w:tcBorders>
+              <w:top w:val="single" w:sz="6" w:space="0" w:color="auto"/>
+              <w:left w:val="single" w:sz="6" w:space="0" w:color="auto"/>
+              <w:bottom w:val="single" w:sz="6" w:space="0" w:color="auto"/>
+              <w:right w:val="single" w:sz="6" w:space="0" w:color="auto"/>
+            </w:tcBorders>
+            <w:tcMar>
+              <w:top w:w="240" w:type="dxa"/>
+              <w:left w:w="0" w:type="dxa"/>
+              <w:bottom w:w="240" w:type="dxa"/>
+              <w:right w:w="180" w:type="dxa"/>
+            </w:tcMar>
+            <w:vAlign w:val="center"/>
+            <w:hideMark/>
+          </w:tcPr>
+          <w:p>
+            <w:r>
+              <w:t>09/03/2026</w:t>
+            </w:r>
+          </w:p>
+        </w:tc>
+        <w:tc>
+          <w:tcPr>
+            <w:tcW w:w="0" w:type="auto"/>
+            <w:tcBorders>
+              <w:top w:val="single" w:sz="6" w:space="0" w:color="auto"/>
+              <w:left w:val="single" w:sz="6" w:space="0" w:color="auto"/>
+              <w:bottom w:val="single" w:sz="6" w:space="0" w:color="auto"/>
+              <w:right w:val="single" w:sz="6" w:space="0" w:color="auto"/>
+            </w:tcBorders>
+            <w:tcMar>
+              <w:top w:w="240" w:type="dxa"/>
+              <w:left w:w="0" w:type="dxa"/>
+              <w:bottom w:w="240" w:type="dxa"/>
+              <w:right w:w="180" w:type="dxa"/>
+            </w:tcMar>
+            <w:vAlign w:val="center"/>
+            <w:hideMark/>
+          </w:tcPr>
+          <w:p>
+            <w:r>
+              <w:t>Ensure the Jetty portal is accessible via mobile/tablets for outdoor operators.</w:t>
+            </w:r>
+          </w:p>
+        </w:tc>
+        <w:tc>
+          <w:tcPr>
+            <w:tcW w:w="0" w:type="auto"/>
+            <w:tcBorders>
+              <w:top w:val="single" w:sz="6" w:space="0" w:color="auto"/>
+              <w:left w:val="single" w:sz="6" w:space="0" w:color="auto"/>
+              <w:bottom w:val="single" w:sz="6" w:space="0" w:color="auto"/>
+              <w:right w:val="single" w:sz="6" w:space="0" w:color="auto"/>
+            </w:tcBorders>
+            <w:tcMar>
+              <w:top w:w="240" w:type="dxa"/>
+              <w:left w:w="0" w:type="dxa"/>
+              <w:bottom w:w="240" w:type="dxa"/>
+              <w:right w:w="180" w:type="dxa"/>
+            </w:tcMar>
+            <w:vAlign w:val="center"/>
+            <w:hideMark/>
+          </w:tcPr>
+          <w:p>
+            <w:r>
+              <w:t>IT Lead</w:t>
+            </w:r>
+          </w:p>
+        </w:tc>
+        <w:tc>
+          <w:tcPr>
+            <w:tcW w:w="0" w:type="auto"/>
+            <w:tcBorders>
+              <w:top w:val="single" w:sz="6" w:space="0" w:color="auto"/>
+              <w:left w:val="single" w:sz="6" w:space="0" w:color="auto"/>
+              <w:bottom w:val="single" w:sz="6" w:space="0" w:color="auto"/>
+              <w:right w:val="single" w:sz="6" w:space="0" w:color="auto"/>
+            </w:tcBorders>
+            <w:tcMar>
+              <w:top w:w="240" w:type="dxa"/>
+              <w:left w:w="0" w:type="dxa"/>
+              <w:bottom w:w="240" w:type="dxa"/>
+              <w:right w:w="0" w:type="dxa"/>
+            </w:tcMar>
+            <w:vAlign w:val="center"/>
+            <w:hideMark/>
+          </w:tcPr>
+          <w:p>
+            <w:r>
+              <w:t>New</w:t>
+            </w:r>
+          </w:p>
+        </w:tc>
+      </w:tr>
+    </w:tbl>
     <w:p/>
     <w:sectPr>
       <w:pgSz w:w="12240" w:h="15840"/>
@@ -1330,9 +3211,9 @@
 <file path=word/numbering.xml><?xml version="1.0" encoding="utf-8"?>
 <w:numbering xmlns:wpc="http://schemas.microsoft.com/office/word/2010/wordprocessingCanvas" xmlns:cx="http://schemas.microsoft.com/office/drawing/2014/chartex" xmlns:cx1="http://schemas.microsoft.com/office/drawing/2015/9/8/chartex" xmlns:cx2="http://schemas.microsoft.com/office/drawing/2015/10/21/chartex" xmlns:cx3="http://schemas.microsoft.com/office/drawing/2016/5/9/chartex" xmlns:cx4="http://schemas.microsoft.com/office/drawing/2016/5/10/chartex" xmlns:cx5="http://schemas.microsoft.com/office/drawing/2016/5/11/chartex" xmlns:cx6="http://schemas.microsoft.com/office/drawing/2016/5/12/chartex" xmlns:cx7="http://schemas.microsoft.com/office/drawing/2016/5/13/chartex" xmlns:cx8="http://schemas.microsoft.com/office/drawing/2016/5/14/chartex" xmlns:mc="http://schemas.openxmlformats.org/markup-compatibility/2006" xmlns:aink="http://schemas.microsoft.com/office/drawing/2016/ink" xmlns:am3d="http://schemas.microsoft.com/office/drawing/2017/model3d" xmlns:o="urn:schemas-microsoft-com:office:office" xmlns:oel="http://schemas.microsoft.com/office/2019/extlst" xmlns:r="http://schemas.openxmlformats.org/officeDocument/2006/relationships" xmlns:m="http://schemas.openxmlformats.org/officeDocument/2006/math" xmlns:v="urn:schemas-microsoft-com:vml" xmlns:wp14="http://schemas.microsoft.com/office/word/2010/wordprocessingDrawing" xmlns:wp="http://schemas.openxmlformats.org/drawingml/2006/wordprocessingDrawing" xmlns:w10="urn:schemas-microsoft-com:office:word" xmlns:w="http://schemas.openxmlformats.org/wordprocessingml/2006/main" xmlns:w14="http://schemas.microsoft.com/office/word/2010/wordml" xmlns:w15="http://schemas.microsoft.com/office/word/2012/wordml" xmlns:w16cex="http://schemas.microsoft.com/office/word/2018/wordml/cex" xmlns:w16cid="http://schemas.microsoft.com/office/word/2016/wordml/cid" xmlns:w16="http://schemas.microsoft.com/office/word/2018/wordml" xmlns:w16du="http://schemas.microsoft.com/office/word/2023/wordml/word16du" xmlns:w16sdtdh="http://schemas.microsoft.com/office/word/2020/wordml/sdtdatahash" xmlns:w16sdtfl="http://schemas.microsoft.com/office/word/2024/wordml/sdtformatlock" xmlns:w16se="http://schemas.microsoft.com/office/word/2015/wordml/symex" xmlns:wpg="http://schemas.microsoft.com/office/word/2010/wordprocessingGroup" xmlns:wpi="http://schemas.microsoft.com/office/word/2010/wordprocessingInk" xmlns:wne="http://schemas.microsoft.com/office/word/2006/wordml" xmlns:wps="http://schemas.microsoft.com/office/word/2010/wordprocessingShape" mc:Ignorable="w14 w15 w16se w16cid w16 w16cex w16sdtdh w16sdtfl w16du wp14">
   <w:abstractNum w:abstractNumId="0" w15:restartNumberingAfterBreak="0">
-    <w:nsid w:val="126565D3"/>
+    <w:nsid w:val="033D6B89"/>
     <w:multiLevelType w:val="multilevel"/>
-    <w:tmpl w:val="43347E92"/>
+    <w:tmpl w:val="80525DD6"/>
     <w:lvl w:ilvl="0">
       <w:start w:val="1"/>
       <w:numFmt w:val="bullet"/>
@@ -1479,9 +3360,9 @@
     </w:lvl>
   </w:abstractNum>
   <w:abstractNum w:abstractNumId="1" w15:restartNumberingAfterBreak="0">
-    <w:nsid w:val="28E76C76"/>
+    <w:nsid w:val="1323484D"/>
     <w:multiLevelType w:val="multilevel"/>
-    <w:tmpl w:val="79D07F7A"/>
+    <w:tmpl w:val="CFAEC60E"/>
     <w:lvl w:ilvl="0">
       <w:start w:val="1"/>
       <w:numFmt w:val="bullet"/>
@@ -1628,9 +3509,9 @@
     </w:lvl>
   </w:abstractNum>
   <w:abstractNum w:abstractNumId="2" w15:restartNumberingAfterBreak="0">
-    <w:nsid w:val="3B8803AA"/>
+    <w:nsid w:val="19725F93"/>
     <w:multiLevelType w:val="multilevel"/>
-    <w:tmpl w:val="6FC8C124"/>
+    <w:tmpl w:val="9C2AA8A6"/>
     <w:lvl w:ilvl="0">
       <w:start w:val="1"/>
       <w:numFmt w:val="bullet"/>
@@ -1777,13 +3658,13 @@
     </w:lvl>
   </w:abstractNum>
   <w:abstractNum w:abstractNumId="3" w15:restartNumberingAfterBreak="0">
-    <w:nsid w:val="5B1A44B2"/>
+    <w:nsid w:val="35762CE0"/>
     <w:multiLevelType w:val="multilevel"/>
-    <w:tmpl w:val="3F86607A"/>
+    <w:tmpl w:val="6BE213FE"/>
     <w:lvl w:ilvl="0">
       <w:start w:val="1"/>
-      <w:numFmt w:val="bullet"/>
-      <w:lvlText w:val=""/>
+      <w:numFmt w:val="decimal"/>
+      <w:lvlText w:val="%1."/>
       <w:lvlJc w:val="left"/>
       <w:pPr>
         <w:tabs>
@@ -1791,15 +3672,11 @@
         </w:tabs>
         <w:ind w:left="720" w:hanging="360"/>
       </w:pPr>
-      <w:rPr>
-        <w:rFonts w:ascii="Symbol" w:hAnsi="Symbol" w:hint="default"/>
-        <w:sz w:val="20"/>
-      </w:rPr>
     </w:lvl>
     <w:lvl w:ilvl="1" w:tentative="1">
       <w:start w:val="1"/>
-      <w:numFmt w:val="bullet"/>
-      <w:lvlText w:val="o"/>
+      <w:numFmt w:val="decimal"/>
+      <w:lvlText w:val="%2."/>
       <w:lvlJc w:val="left"/>
       <w:pPr>
         <w:tabs>
@@ -1807,15 +3684,11 @@
         </w:tabs>
         <w:ind w:left="1440" w:hanging="360"/>
       </w:pPr>
-      <w:rPr>
-        <w:rFonts w:ascii="Courier New" w:hAnsi="Courier New" w:hint="default"/>
-        <w:sz w:val="20"/>
-      </w:rPr>
     </w:lvl>
     <w:lvl w:ilvl="2" w:tentative="1">
       <w:start w:val="1"/>
-      <w:numFmt w:val="bullet"/>
-      <w:lvlText w:val=""/>
+      <w:numFmt w:val="decimal"/>
+      <w:lvlText w:val="%3."/>
       <w:lvlJc w:val="left"/>
       <w:pPr>
         <w:tabs>
@@ -1823,15 +3696,11 @@
         </w:tabs>
         <w:ind w:left="2160" w:hanging="360"/>
       </w:pPr>
-      <w:rPr>
-        <w:rFonts w:ascii="Wingdings" w:hAnsi="Wingdings" w:hint="default"/>
-        <w:sz w:val="20"/>
-      </w:rPr>
     </w:lvl>
     <w:lvl w:ilvl="3" w:tentative="1">
       <w:start w:val="1"/>
-      <w:numFmt w:val="bullet"/>
-      <w:lvlText w:val=""/>
+      <w:numFmt w:val="decimal"/>
+      <w:lvlText w:val="%4."/>
       <w:lvlJc w:val="left"/>
       <w:pPr>
         <w:tabs>
@@ -1839,15 +3708,11 @@
         </w:tabs>
         <w:ind w:left="2880" w:hanging="360"/>
       </w:pPr>
-      <w:rPr>
-        <w:rFonts w:ascii="Wingdings" w:hAnsi="Wingdings" w:hint="default"/>
-        <w:sz w:val="20"/>
-      </w:rPr>
     </w:lvl>
     <w:lvl w:ilvl="4" w:tentative="1">
       <w:start w:val="1"/>
-      <w:numFmt w:val="bullet"/>
-      <w:lvlText w:val=""/>
+      <w:numFmt w:val="decimal"/>
+      <w:lvlText w:val="%5."/>
       <w:lvlJc w:val="left"/>
       <w:pPr>
         <w:tabs>
@@ -1855,15 +3720,11 @@
         </w:tabs>
         <w:ind w:left="3600" w:hanging="360"/>
       </w:pPr>
-      <w:rPr>
-        <w:rFonts w:ascii="Wingdings" w:hAnsi="Wingdings" w:hint="default"/>
-        <w:sz w:val="20"/>
-      </w:rPr>
     </w:lvl>
     <w:lvl w:ilvl="5" w:tentative="1">
       <w:start w:val="1"/>
-      <w:numFmt w:val="bullet"/>
-      <w:lvlText w:val=""/>
+      <w:numFmt w:val="decimal"/>
+      <w:lvlText w:val="%6."/>
       <w:lvlJc w:val="left"/>
       <w:pPr>
         <w:tabs>
@@ -1871,15 +3732,11 @@
         </w:tabs>
         <w:ind w:left="4320" w:hanging="360"/>
       </w:pPr>
-      <w:rPr>
-        <w:rFonts w:ascii="Wingdings" w:hAnsi="Wingdings" w:hint="default"/>
-        <w:sz w:val="20"/>
-      </w:rPr>
     </w:lvl>
     <w:lvl w:ilvl="6" w:tentative="1">
       <w:start w:val="1"/>
-      <w:numFmt w:val="bullet"/>
-      <w:lvlText w:val=""/>
+      <w:numFmt w:val="decimal"/>
+      <w:lvlText w:val="%7."/>
       <w:lvlJc w:val="left"/>
       <w:pPr>
         <w:tabs>
@@ -1887,15 +3744,11 @@
         </w:tabs>
         <w:ind w:left="5040" w:hanging="360"/>
       </w:pPr>
-      <w:rPr>
-        <w:rFonts w:ascii="Wingdings" w:hAnsi="Wingdings" w:hint="default"/>
-        <w:sz w:val="20"/>
-      </w:rPr>
     </w:lvl>
     <w:lvl w:ilvl="7" w:tentative="1">
       <w:start w:val="1"/>
-      <w:numFmt w:val="bullet"/>
-      <w:lvlText w:val=""/>
+      <w:numFmt w:val="decimal"/>
+      <w:lvlText w:val="%8."/>
       <w:lvlJc w:val="left"/>
       <w:pPr>
         <w:tabs>
@@ -1903,15 +3756,11 @@
         </w:tabs>
         <w:ind w:left="5760" w:hanging="360"/>
       </w:pPr>
-      <w:rPr>
-        <w:rFonts w:ascii="Wingdings" w:hAnsi="Wingdings" w:hint="default"/>
-        <w:sz w:val="20"/>
-      </w:rPr>
     </w:lvl>
     <w:lvl w:ilvl="8" w:tentative="1">
       <w:start w:val="1"/>
-      <w:numFmt w:val="bullet"/>
-      <w:lvlText w:val=""/>
+      <w:numFmt w:val="decimal"/>
+      <w:lvlText w:val="%9."/>
       <w:lvlJc w:val="left"/>
       <w:pPr>
         <w:tabs>
@@ -1919,20 +3768,16 @@
         </w:tabs>
         <w:ind w:left="6480" w:hanging="360"/>
       </w:pPr>
-      <w:rPr>
-        <w:rFonts w:ascii="Wingdings" w:hAnsi="Wingdings" w:hint="default"/>
-        <w:sz w:val="20"/>
-      </w:rPr>
     </w:lvl>
   </w:abstractNum>
   <w:abstractNum w:abstractNumId="4" w15:restartNumberingAfterBreak="0">
-    <w:nsid w:val="5DA135F3"/>
+    <w:nsid w:val="3ACE23E2"/>
     <w:multiLevelType w:val="multilevel"/>
-    <w:tmpl w:val="B97E98C6"/>
+    <w:tmpl w:val="BADC0F8A"/>
     <w:lvl w:ilvl="0">
       <w:start w:val="1"/>
-      <w:numFmt w:val="decimal"/>
-      <w:lvlText w:val="%1."/>
+      <w:numFmt w:val="bullet"/>
+      <w:lvlText w:val=""/>
       <w:lvlJc w:val="left"/>
       <w:pPr>
         <w:tabs>
@@ -1940,11 +3785,15 @@
         </w:tabs>
         <w:ind w:left="720" w:hanging="360"/>
       </w:pPr>
+      <w:rPr>
+        <w:rFonts w:ascii="Symbol" w:hAnsi="Symbol" w:hint="default"/>
+        <w:sz w:val="20"/>
+      </w:rPr>
     </w:lvl>
     <w:lvl w:ilvl="1" w:tentative="1">
       <w:start w:val="1"/>
-      <w:numFmt w:val="decimal"/>
-      <w:lvlText w:val="%2."/>
+      <w:numFmt w:val="bullet"/>
+      <w:lvlText w:val="o"/>
       <w:lvlJc w:val="left"/>
       <w:pPr>
         <w:tabs>
@@ -1952,11 +3801,15 @@
         </w:tabs>
         <w:ind w:left="1440" w:hanging="360"/>
       </w:pPr>
+      <w:rPr>
+        <w:rFonts w:ascii="Courier New" w:hAnsi="Courier New" w:hint="default"/>
+        <w:sz w:val="20"/>
+      </w:rPr>
     </w:lvl>
     <w:lvl w:ilvl="2" w:tentative="1">
       <w:start w:val="1"/>
-      <w:numFmt w:val="decimal"/>
-      <w:lvlText w:val="%3."/>
+      <w:numFmt w:val="bullet"/>
+      <w:lvlText w:val=""/>
       <w:lvlJc w:val="left"/>
       <w:pPr>
         <w:tabs>
@@ -1964,11 +3817,15 @@
         </w:tabs>
         <w:ind w:left="2160" w:hanging="360"/>
       </w:pPr>
+      <w:rPr>
+        <w:rFonts w:ascii="Wingdings" w:hAnsi="Wingdings" w:hint="default"/>
+        <w:sz w:val="20"/>
+      </w:rPr>
     </w:lvl>
     <w:lvl w:ilvl="3" w:tentative="1">
       <w:start w:val="1"/>
-      <w:numFmt w:val="decimal"/>
-      <w:lvlText w:val="%4."/>
+      <w:numFmt w:val="bullet"/>
+      <w:lvlText w:val=""/>
       <w:lvlJc w:val="left"/>
       <w:pPr>
         <w:tabs>
@@ -1976,11 +3833,15 @@
         </w:tabs>
         <w:ind w:left="2880" w:hanging="360"/>
       </w:pPr>
+      <w:rPr>
+        <w:rFonts w:ascii="Wingdings" w:hAnsi="Wingdings" w:hint="default"/>
+        <w:sz w:val="20"/>
+      </w:rPr>
     </w:lvl>
     <w:lvl w:ilvl="4" w:tentative="1">
       <w:start w:val="1"/>
-      <w:numFmt w:val="decimal"/>
-      <w:lvlText w:val="%5."/>
+      <w:numFmt w:val="bullet"/>
+      <w:lvlText w:val=""/>
       <w:lvlJc w:val="left"/>
       <w:pPr>
         <w:tabs>
@@ -1988,11 +3849,15 @@
         </w:tabs>
         <w:ind w:left="3600" w:hanging="360"/>
       </w:pPr>
+      <w:rPr>
+        <w:rFonts w:ascii="Wingdings" w:hAnsi="Wingdings" w:hint="default"/>
+        <w:sz w:val="20"/>
+      </w:rPr>
     </w:lvl>
     <w:lvl w:ilvl="5" w:tentative="1">
       <w:start w:val="1"/>
-      <w:numFmt w:val="decimal"/>
-      <w:lvlText w:val="%6."/>
+      <w:numFmt w:val="bullet"/>
+      <w:lvlText w:val=""/>
       <w:lvlJc w:val="left"/>
       <w:pPr>
         <w:tabs>
@@ -2000,11 +3865,15 @@
         </w:tabs>
         <w:ind w:left="4320" w:hanging="360"/>
       </w:pPr>
+      <w:rPr>
+        <w:rFonts w:ascii="Wingdings" w:hAnsi="Wingdings" w:hint="default"/>
+        <w:sz w:val="20"/>
+      </w:rPr>
     </w:lvl>
     <w:lvl w:ilvl="6" w:tentative="1">
       <w:start w:val="1"/>
-      <w:numFmt w:val="decimal"/>
-      <w:lvlText w:val="%7."/>
+      <w:numFmt w:val="bullet"/>
+      <w:lvlText w:val=""/>
       <w:lvlJc w:val="left"/>
       <w:pPr>
         <w:tabs>
@@ -2012,11 +3881,15 @@
         </w:tabs>
         <w:ind w:left="5040" w:hanging="360"/>
       </w:pPr>
+      <w:rPr>
+        <w:rFonts w:ascii="Wingdings" w:hAnsi="Wingdings" w:hint="default"/>
+        <w:sz w:val="20"/>
+      </w:rPr>
     </w:lvl>
     <w:lvl w:ilvl="7" w:tentative="1">
       <w:start w:val="1"/>
-      <w:numFmt w:val="decimal"/>
-      <w:lvlText w:val="%8."/>
+      <w:numFmt w:val="bullet"/>
+      <w:lvlText w:val=""/>
       <w:lvlJc w:val="left"/>
       <w:pPr>
         <w:tabs>
@@ -2024,11 +3897,15 @@
         </w:tabs>
         <w:ind w:left="5760" w:hanging="360"/>
       </w:pPr>
+      <w:rPr>
+        <w:rFonts w:ascii="Wingdings" w:hAnsi="Wingdings" w:hint="default"/>
+        <w:sz w:val="20"/>
+      </w:rPr>
     </w:lvl>
     <w:lvl w:ilvl="8" w:tentative="1">
       <w:start w:val="1"/>
-      <w:numFmt w:val="decimal"/>
-      <w:lvlText w:val="%9."/>
+      <w:numFmt w:val="bullet"/>
+      <w:lvlText w:val=""/>
       <w:lvlJc w:val="left"/>
       <w:pPr>
         <w:tabs>
@@ -2036,22 +3913,634 @@
         </w:tabs>
         <w:ind w:left="6480" w:hanging="360"/>
       </w:pPr>
+      <w:rPr>
+        <w:rFonts w:ascii="Wingdings" w:hAnsi="Wingdings" w:hint="default"/>
+        <w:sz w:val="20"/>
+      </w:rPr>
     </w:lvl>
   </w:abstractNum>
-  <w:num w:numId="1" w16cid:durableId="78717011">
+  <w:abstractNum w:abstractNumId="5" w15:restartNumberingAfterBreak="0">
+    <w:nsid w:val="43420858"/>
+    <w:multiLevelType w:val="multilevel"/>
+    <w:tmpl w:val="85545FD8"/>
+    <w:lvl w:ilvl="0">
+      <w:start w:val="1"/>
+      <w:numFmt w:val="bullet"/>
+      <w:lvlText w:val=""/>
+      <w:lvlJc w:val="left"/>
+      <w:pPr>
+        <w:tabs>
+          <w:tab w:val="num" w:pos="720"/>
+        </w:tabs>
+        <w:ind w:left="720" w:hanging="360"/>
+      </w:pPr>
+      <w:rPr>
+        <w:rFonts w:ascii="Symbol" w:hAnsi="Symbol" w:hint="default"/>
+        <w:sz w:val="20"/>
+      </w:rPr>
+    </w:lvl>
+    <w:lvl w:ilvl="1" w:tentative="1">
+      <w:start w:val="1"/>
+      <w:numFmt w:val="bullet"/>
+      <w:lvlText w:val="o"/>
+      <w:lvlJc w:val="left"/>
+      <w:pPr>
+        <w:tabs>
+          <w:tab w:val="num" w:pos="1440"/>
+        </w:tabs>
+        <w:ind w:left="1440" w:hanging="360"/>
+      </w:pPr>
+      <w:rPr>
+        <w:rFonts w:ascii="Courier New" w:hAnsi="Courier New" w:hint="default"/>
+        <w:sz w:val="20"/>
+      </w:rPr>
+    </w:lvl>
+    <w:lvl w:ilvl="2" w:tentative="1">
+      <w:start w:val="1"/>
+      <w:numFmt w:val="bullet"/>
+      <w:lvlText w:val=""/>
+      <w:lvlJc w:val="left"/>
+      <w:pPr>
+        <w:tabs>
+          <w:tab w:val="num" w:pos="2160"/>
+        </w:tabs>
+        <w:ind w:left="2160" w:hanging="360"/>
+      </w:pPr>
+      <w:rPr>
+        <w:rFonts w:ascii="Wingdings" w:hAnsi="Wingdings" w:hint="default"/>
+        <w:sz w:val="20"/>
+      </w:rPr>
+    </w:lvl>
+    <w:lvl w:ilvl="3" w:tentative="1">
+      <w:start w:val="1"/>
+      <w:numFmt w:val="bullet"/>
+      <w:lvlText w:val=""/>
+      <w:lvlJc w:val="left"/>
+      <w:pPr>
+        <w:tabs>
+          <w:tab w:val="num" w:pos="2880"/>
+        </w:tabs>
+        <w:ind w:left="2880" w:hanging="360"/>
+      </w:pPr>
+      <w:rPr>
+        <w:rFonts w:ascii="Wingdings" w:hAnsi="Wingdings" w:hint="default"/>
+        <w:sz w:val="20"/>
+      </w:rPr>
+    </w:lvl>
+    <w:lvl w:ilvl="4" w:tentative="1">
+      <w:start w:val="1"/>
+      <w:numFmt w:val="bullet"/>
+      <w:lvlText w:val=""/>
+      <w:lvlJc w:val="left"/>
+      <w:pPr>
+        <w:tabs>
+          <w:tab w:val="num" w:pos="3600"/>
+        </w:tabs>
+        <w:ind w:left="3600" w:hanging="360"/>
+      </w:pPr>
+      <w:rPr>
+        <w:rFonts w:ascii="Wingdings" w:hAnsi="Wingdings" w:hint="default"/>
+        <w:sz w:val="20"/>
+      </w:rPr>
+    </w:lvl>
+    <w:lvl w:ilvl="5" w:tentative="1">
+      <w:start w:val="1"/>
+      <w:numFmt w:val="bullet"/>
+      <w:lvlText w:val=""/>
+      <w:lvlJc w:val="left"/>
+      <w:pPr>
+        <w:tabs>
+          <w:tab w:val="num" w:pos="4320"/>
+        </w:tabs>
+        <w:ind w:left="4320" w:hanging="360"/>
+      </w:pPr>
+      <w:rPr>
+        <w:rFonts w:ascii="Wingdings" w:hAnsi="Wingdings" w:hint="default"/>
+        <w:sz w:val="20"/>
+      </w:rPr>
+    </w:lvl>
+    <w:lvl w:ilvl="6" w:tentative="1">
+      <w:start w:val="1"/>
+      <w:numFmt w:val="bullet"/>
+      <w:lvlText w:val=""/>
+      <w:lvlJc w:val="left"/>
+      <w:pPr>
+        <w:tabs>
+          <w:tab w:val="num" w:pos="5040"/>
+        </w:tabs>
+        <w:ind w:left="5040" w:hanging="360"/>
+      </w:pPr>
+      <w:rPr>
+        <w:rFonts w:ascii="Wingdings" w:hAnsi="Wingdings" w:hint="default"/>
+        <w:sz w:val="20"/>
+      </w:rPr>
+    </w:lvl>
+    <w:lvl w:ilvl="7" w:tentative="1">
+      <w:start w:val="1"/>
+      <w:numFmt w:val="bullet"/>
+      <w:lvlText w:val=""/>
+      <w:lvlJc w:val="left"/>
+      <w:pPr>
+        <w:tabs>
+          <w:tab w:val="num" w:pos="5760"/>
+        </w:tabs>
+        <w:ind w:left="5760" w:hanging="360"/>
+      </w:pPr>
+      <w:rPr>
+        <w:rFonts w:ascii="Wingdings" w:hAnsi="Wingdings" w:hint="default"/>
+        <w:sz w:val="20"/>
+      </w:rPr>
+    </w:lvl>
+    <w:lvl w:ilvl="8" w:tentative="1">
+      <w:start w:val="1"/>
+      <w:numFmt w:val="bullet"/>
+      <w:lvlText w:val=""/>
+      <w:lvlJc w:val="left"/>
+      <w:pPr>
+        <w:tabs>
+          <w:tab w:val="num" w:pos="6480"/>
+        </w:tabs>
+        <w:ind w:left="6480" w:hanging="360"/>
+      </w:pPr>
+      <w:rPr>
+        <w:rFonts w:ascii="Wingdings" w:hAnsi="Wingdings" w:hint="default"/>
+        <w:sz w:val="20"/>
+      </w:rPr>
+    </w:lvl>
+  </w:abstractNum>
+  <w:abstractNum w:abstractNumId="6" w15:restartNumberingAfterBreak="0">
+    <w:nsid w:val="59A43F0B"/>
+    <w:multiLevelType w:val="multilevel"/>
+    <w:tmpl w:val="AAF2B8B2"/>
+    <w:lvl w:ilvl="0">
+      <w:start w:val="1"/>
+      <w:numFmt w:val="bullet"/>
+      <w:lvlText w:val=""/>
+      <w:lvlJc w:val="left"/>
+      <w:pPr>
+        <w:tabs>
+          <w:tab w:val="num" w:pos="720"/>
+        </w:tabs>
+        <w:ind w:left="720" w:hanging="360"/>
+      </w:pPr>
+      <w:rPr>
+        <w:rFonts w:ascii="Symbol" w:hAnsi="Symbol" w:hint="default"/>
+        <w:sz w:val="20"/>
+      </w:rPr>
+    </w:lvl>
+    <w:lvl w:ilvl="1" w:tentative="1">
+      <w:start w:val="1"/>
+      <w:numFmt w:val="bullet"/>
+      <w:lvlText w:val="o"/>
+      <w:lvlJc w:val="left"/>
+      <w:pPr>
+        <w:tabs>
+          <w:tab w:val="num" w:pos="1440"/>
+        </w:tabs>
+        <w:ind w:left="1440" w:hanging="360"/>
+      </w:pPr>
+      <w:rPr>
+        <w:rFonts w:ascii="Courier New" w:hAnsi="Courier New" w:hint="default"/>
+        <w:sz w:val="20"/>
+      </w:rPr>
+    </w:lvl>
+    <w:lvl w:ilvl="2" w:tentative="1">
+      <w:start w:val="1"/>
+      <w:numFmt w:val="bullet"/>
+      <w:lvlText w:val=""/>
+      <w:lvlJc w:val="left"/>
+      <w:pPr>
+        <w:tabs>
+          <w:tab w:val="num" w:pos="2160"/>
+        </w:tabs>
+        <w:ind w:left="2160" w:hanging="360"/>
+      </w:pPr>
+      <w:rPr>
+        <w:rFonts w:ascii="Wingdings" w:hAnsi="Wingdings" w:hint="default"/>
+        <w:sz w:val="20"/>
+      </w:rPr>
+    </w:lvl>
+    <w:lvl w:ilvl="3" w:tentative="1">
+      <w:start w:val="1"/>
+      <w:numFmt w:val="bullet"/>
+      <w:lvlText w:val=""/>
+      <w:lvlJc w:val="left"/>
+      <w:pPr>
+        <w:tabs>
+          <w:tab w:val="num" w:pos="2880"/>
+        </w:tabs>
+        <w:ind w:left="2880" w:hanging="360"/>
+      </w:pPr>
+      <w:rPr>
+        <w:rFonts w:ascii="Wingdings" w:hAnsi="Wingdings" w:hint="default"/>
+        <w:sz w:val="20"/>
+      </w:rPr>
+    </w:lvl>
+    <w:lvl w:ilvl="4" w:tentative="1">
+      <w:start w:val="1"/>
+      <w:numFmt w:val="bullet"/>
+      <w:lvlText w:val=""/>
+      <w:lvlJc w:val="left"/>
+      <w:pPr>
+        <w:tabs>
+          <w:tab w:val="num" w:pos="3600"/>
+        </w:tabs>
+        <w:ind w:left="3600" w:hanging="360"/>
+      </w:pPr>
+      <w:rPr>
+        <w:rFonts w:ascii="Wingdings" w:hAnsi="Wingdings" w:hint="default"/>
+        <w:sz w:val="20"/>
+      </w:rPr>
+    </w:lvl>
+    <w:lvl w:ilvl="5" w:tentative="1">
+      <w:start w:val="1"/>
+      <w:numFmt w:val="bullet"/>
+      <w:lvlText w:val=""/>
+      <w:lvlJc w:val="left"/>
+      <w:pPr>
+        <w:tabs>
+          <w:tab w:val="num" w:pos="4320"/>
+        </w:tabs>
+        <w:ind w:left="4320" w:hanging="360"/>
+      </w:pPr>
+      <w:rPr>
+        <w:rFonts w:ascii="Wingdings" w:hAnsi="Wingdings" w:hint="default"/>
+        <w:sz w:val="20"/>
+      </w:rPr>
+    </w:lvl>
+    <w:lvl w:ilvl="6" w:tentative="1">
+      <w:start w:val="1"/>
+      <w:numFmt w:val="bullet"/>
+      <w:lvlText w:val=""/>
+      <w:lvlJc w:val="left"/>
+      <w:pPr>
+        <w:tabs>
+          <w:tab w:val="num" w:pos="5040"/>
+        </w:tabs>
+        <w:ind w:left="5040" w:hanging="360"/>
+      </w:pPr>
+      <w:rPr>
+        <w:rFonts w:ascii="Wingdings" w:hAnsi="Wingdings" w:hint="default"/>
+        <w:sz w:val="20"/>
+      </w:rPr>
+    </w:lvl>
+    <w:lvl w:ilvl="7" w:tentative="1">
+      <w:start w:val="1"/>
+      <w:numFmt w:val="bullet"/>
+      <w:lvlText w:val=""/>
+      <w:lvlJc w:val="left"/>
+      <w:pPr>
+        <w:tabs>
+          <w:tab w:val="num" w:pos="5760"/>
+        </w:tabs>
+        <w:ind w:left="5760" w:hanging="360"/>
+      </w:pPr>
+      <w:rPr>
+        <w:rFonts w:ascii="Wingdings" w:hAnsi="Wingdings" w:hint="default"/>
+        <w:sz w:val="20"/>
+      </w:rPr>
+    </w:lvl>
+    <w:lvl w:ilvl="8" w:tentative="1">
+      <w:start w:val="1"/>
+      <w:numFmt w:val="bullet"/>
+      <w:lvlText w:val=""/>
+      <w:lvlJc w:val="left"/>
+      <w:pPr>
+        <w:tabs>
+          <w:tab w:val="num" w:pos="6480"/>
+        </w:tabs>
+        <w:ind w:left="6480" w:hanging="360"/>
+      </w:pPr>
+      <w:rPr>
+        <w:rFonts w:ascii="Wingdings" w:hAnsi="Wingdings" w:hint="default"/>
+        <w:sz w:val="20"/>
+      </w:rPr>
+    </w:lvl>
+  </w:abstractNum>
+  <w:abstractNum w:abstractNumId="7" w15:restartNumberingAfterBreak="0">
+    <w:nsid w:val="59AC6C76"/>
+    <w:multiLevelType w:val="multilevel"/>
+    <w:tmpl w:val="5A447768"/>
+    <w:lvl w:ilvl="0">
+      <w:start w:val="1"/>
+      <w:numFmt w:val="bullet"/>
+      <w:lvlText w:val=""/>
+      <w:lvlJc w:val="left"/>
+      <w:pPr>
+        <w:tabs>
+          <w:tab w:val="num" w:pos="720"/>
+        </w:tabs>
+        <w:ind w:left="720" w:hanging="360"/>
+      </w:pPr>
+      <w:rPr>
+        <w:rFonts w:ascii="Symbol" w:hAnsi="Symbol" w:hint="default"/>
+        <w:sz w:val="20"/>
+      </w:rPr>
+    </w:lvl>
+    <w:lvl w:ilvl="1" w:tentative="1">
+      <w:start w:val="1"/>
+      <w:numFmt w:val="bullet"/>
+      <w:lvlText w:val="o"/>
+      <w:lvlJc w:val="left"/>
+      <w:pPr>
+        <w:tabs>
+          <w:tab w:val="num" w:pos="1440"/>
+        </w:tabs>
+        <w:ind w:left="1440" w:hanging="360"/>
+      </w:pPr>
+      <w:rPr>
+        <w:rFonts w:ascii="Courier New" w:hAnsi="Courier New" w:hint="default"/>
+        <w:sz w:val="20"/>
+      </w:rPr>
+    </w:lvl>
+    <w:lvl w:ilvl="2" w:tentative="1">
+      <w:start w:val="1"/>
+      <w:numFmt w:val="bullet"/>
+      <w:lvlText w:val=""/>
+      <w:lvlJc w:val="left"/>
+      <w:pPr>
+        <w:tabs>
+          <w:tab w:val="num" w:pos="2160"/>
+        </w:tabs>
+        <w:ind w:left="2160" w:hanging="360"/>
+      </w:pPr>
+      <w:rPr>
+        <w:rFonts w:ascii="Wingdings" w:hAnsi="Wingdings" w:hint="default"/>
+        <w:sz w:val="20"/>
+      </w:rPr>
+    </w:lvl>
+    <w:lvl w:ilvl="3" w:tentative="1">
+      <w:start w:val="1"/>
+      <w:numFmt w:val="bullet"/>
+      <w:lvlText w:val=""/>
+      <w:lvlJc w:val="left"/>
+      <w:pPr>
+        <w:tabs>
+          <w:tab w:val="num" w:pos="2880"/>
+        </w:tabs>
+        <w:ind w:left="2880" w:hanging="360"/>
+      </w:pPr>
+      <w:rPr>
+        <w:rFonts w:ascii="Wingdings" w:hAnsi="Wingdings" w:hint="default"/>
+        <w:sz w:val="20"/>
+      </w:rPr>
+    </w:lvl>
+    <w:lvl w:ilvl="4" w:tentative="1">
+      <w:start w:val="1"/>
+      <w:numFmt w:val="bullet"/>
+      <w:lvlText w:val=""/>
+      <w:lvlJc w:val="left"/>
+      <w:pPr>
+        <w:tabs>
+          <w:tab w:val="num" w:pos="3600"/>
+        </w:tabs>
+        <w:ind w:left="3600" w:hanging="360"/>
+      </w:pPr>
+      <w:rPr>
+        <w:rFonts w:ascii="Wingdings" w:hAnsi="Wingdings" w:hint="default"/>
+        <w:sz w:val="20"/>
+      </w:rPr>
+    </w:lvl>
+    <w:lvl w:ilvl="5" w:tentative="1">
+      <w:start w:val="1"/>
+      <w:numFmt w:val="bullet"/>
+      <w:lvlText w:val=""/>
+      <w:lvlJc w:val="left"/>
+      <w:pPr>
+        <w:tabs>
+          <w:tab w:val="num" w:pos="4320"/>
+        </w:tabs>
+        <w:ind w:left="4320" w:hanging="360"/>
+      </w:pPr>
+      <w:rPr>
+        <w:rFonts w:ascii="Wingdings" w:hAnsi="Wingdings" w:hint="default"/>
+        <w:sz w:val="20"/>
+      </w:rPr>
+    </w:lvl>
+    <w:lvl w:ilvl="6" w:tentative="1">
+      <w:start w:val="1"/>
+      <w:numFmt w:val="bullet"/>
+      <w:lvlText w:val=""/>
+      <w:lvlJc w:val="left"/>
+      <w:pPr>
+        <w:tabs>
+          <w:tab w:val="num" w:pos="5040"/>
+        </w:tabs>
+        <w:ind w:left="5040" w:hanging="360"/>
+      </w:pPr>
+      <w:rPr>
+        <w:rFonts w:ascii="Wingdings" w:hAnsi="Wingdings" w:hint="default"/>
+        <w:sz w:val="20"/>
+      </w:rPr>
+    </w:lvl>
+    <w:lvl w:ilvl="7" w:tentative="1">
+      <w:start w:val="1"/>
+      <w:numFmt w:val="bullet"/>
+      <w:lvlText w:val=""/>
+      <w:lvlJc w:val="left"/>
+      <w:pPr>
+        <w:tabs>
+          <w:tab w:val="num" w:pos="5760"/>
+        </w:tabs>
+        <w:ind w:left="5760" w:hanging="360"/>
+      </w:pPr>
+      <w:rPr>
+        <w:rFonts w:ascii="Wingdings" w:hAnsi="Wingdings" w:hint="default"/>
+        <w:sz w:val="20"/>
+      </w:rPr>
+    </w:lvl>
+    <w:lvl w:ilvl="8" w:tentative="1">
+      <w:start w:val="1"/>
+      <w:numFmt w:val="bullet"/>
+      <w:lvlText w:val=""/>
+      <w:lvlJc w:val="left"/>
+      <w:pPr>
+        <w:tabs>
+          <w:tab w:val="num" w:pos="6480"/>
+        </w:tabs>
+        <w:ind w:left="6480" w:hanging="360"/>
+      </w:pPr>
+      <w:rPr>
+        <w:rFonts w:ascii="Wingdings" w:hAnsi="Wingdings" w:hint="default"/>
+        <w:sz w:val="20"/>
+      </w:rPr>
+    </w:lvl>
+  </w:abstractNum>
+  <w:abstractNum w:abstractNumId="8" w15:restartNumberingAfterBreak="0">
+    <w:nsid w:val="61D338C7"/>
+    <w:multiLevelType w:val="multilevel"/>
+    <w:tmpl w:val="E34A1CE4"/>
+    <w:lvl w:ilvl="0">
+      <w:start w:val="1"/>
+      <w:numFmt w:val="bullet"/>
+      <w:lvlText w:val=""/>
+      <w:lvlJc w:val="left"/>
+      <w:pPr>
+        <w:tabs>
+          <w:tab w:val="num" w:pos="720"/>
+        </w:tabs>
+        <w:ind w:left="720" w:hanging="360"/>
+      </w:pPr>
+      <w:rPr>
+        <w:rFonts w:ascii="Symbol" w:hAnsi="Symbol" w:hint="default"/>
+        <w:sz w:val="20"/>
+      </w:rPr>
+    </w:lvl>
+    <w:lvl w:ilvl="1" w:tentative="1">
+      <w:start w:val="1"/>
+      <w:numFmt w:val="bullet"/>
+      <w:lvlText w:val="o"/>
+      <w:lvlJc w:val="left"/>
+      <w:pPr>
+        <w:tabs>
+          <w:tab w:val="num" w:pos="1440"/>
+        </w:tabs>
+        <w:ind w:left="1440" w:hanging="360"/>
+      </w:pPr>
+      <w:rPr>
+        <w:rFonts w:ascii="Courier New" w:hAnsi="Courier New" w:hint="default"/>
+        <w:sz w:val="20"/>
+      </w:rPr>
+    </w:lvl>
+    <w:lvl w:ilvl="2" w:tentative="1">
+      <w:start w:val="1"/>
+      <w:numFmt w:val="bullet"/>
+      <w:lvlText w:val=""/>
+      <w:lvlJc w:val="left"/>
+      <w:pPr>
+        <w:tabs>
+          <w:tab w:val="num" w:pos="2160"/>
+        </w:tabs>
+        <w:ind w:left="2160" w:hanging="360"/>
+      </w:pPr>
+      <w:rPr>
+        <w:rFonts w:ascii="Wingdings" w:hAnsi="Wingdings" w:hint="default"/>
+        <w:sz w:val="20"/>
+      </w:rPr>
+    </w:lvl>
+    <w:lvl w:ilvl="3" w:tentative="1">
+      <w:start w:val="1"/>
+      <w:numFmt w:val="bullet"/>
+      <w:lvlText w:val=""/>
+      <w:lvlJc w:val="left"/>
+      <w:pPr>
+        <w:tabs>
+          <w:tab w:val="num" w:pos="2880"/>
+        </w:tabs>
+        <w:ind w:left="2880" w:hanging="360"/>
+      </w:pPr>
+      <w:rPr>
+        <w:rFonts w:ascii="Wingdings" w:hAnsi="Wingdings" w:hint="default"/>
+        <w:sz w:val="20"/>
+      </w:rPr>
+    </w:lvl>
+    <w:lvl w:ilvl="4" w:tentative="1">
+      <w:start w:val="1"/>
+      <w:numFmt w:val="bullet"/>
+      <w:lvlText w:val=""/>
+      <w:lvlJc w:val="left"/>
+      <w:pPr>
+        <w:tabs>
+          <w:tab w:val="num" w:pos="3600"/>
+        </w:tabs>
+        <w:ind w:left="3600" w:hanging="360"/>
+      </w:pPr>
+      <w:rPr>
+        <w:rFonts w:ascii="Wingdings" w:hAnsi="Wingdings" w:hint="default"/>
+        <w:sz w:val="20"/>
+      </w:rPr>
+    </w:lvl>
+    <w:lvl w:ilvl="5" w:tentative="1">
+      <w:start w:val="1"/>
+      <w:numFmt w:val="bullet"/>
+      <w:lvlText w:val=""/>
+      <w:lvlJc w:val="left"/>
+      <w:pPr>
+        <w:tabs>
+          <w:tab w:val="num" w:pos="4320"/>
+        </w:tabs>
+        <w:ind w:left="4320" w:hanging="360"/>
+      </w:pPr>
+      <w:rPr>
+        <w:rFonts w:ascii="Wingdings" w:hAnsi="Wingdings" w:hint="default"/>
+        <w:sz w:val="20"/>
+      </w:rPr>
+    </w:lvl>
+    <w:lvl w:ilvl="6" w:tentative="1">
+      <w:start w:val="1"/>
+      <w:numFmt w:val="bullet"/>
+      <w:lvlText w:val=""/>
+      <w:lvlJc w:val="left"/>
+      <w:pPr>
+        <w:tabs>
+          <w:tab w:val="num" w:pos="5040"/>
+        </w:tabs>
+        <w:ind w:left="5040" w:hanging="360"/>
+      </w:pPr>
+      <w:rPr>
+        <w:rFonts w:ascii="Wingdings" w:hAnsi="Wingdings" w:hint="default"/>
+        <w:sz w:val="20"/>
+      </w:rPr>
+    </w:lvl>
+    <w:lvl w:ilvl="7" w:tentative="1">
+      <w:start w:val="1"/>
+      <w:numFmt w:val="bullet"/>
+      <w:lvlText w:val=""/>
+      <w:lvlJc w:val="left"/>
+      <w:pPr>
+        <w:tabs>
+          <w:tab w:val="num" w:pos="5760"/>
+        </w:tabs>
+        <w:ind w:left="5760" w:hanging="360"/>
+      </w:pPr>
+      <w:rPr>
+        <w:rFonts w:ascii="Wingdings" w:hAnsi="Wingdings" w:hint="default"/>
+        <w:sz w:val="20"/>
+      </w:rPr>
+    </w:lvl>
+    <w:lvl w:ilvl="8" w:tentative="1">
+      <w:start w:val="1"/>
+      <w:numFmt w:val="bullet"/>
+      <w:lvlText w:val=""/>
+      <w:lvlJc w:val="left"/>
+      <w:pPr>
+        <w:tabs>
+          <w:tab w:val="num" w:pos="6480"/>
+        </w:tabs>
+        <w:ind w:left="6480" w:hanging="360"/>
+      </w:pPr>
+      <w:rPr>
+        <w:rFonts w:ascii="Wingdings" w:hAnsi="Wingdings" w:hint="default"/>
+        <w:sz w:val="20"/>
+      </w:rPr>
+    </w:lvl>
+  </w:abstractNum>
+  <w:num w:numId="1" w16cid:durableId="1487822471">
+    <w:abstractNumId w:val="8"/>
+  </w:num>
+  <w:num w:numId="2" w16cid:durableId="1067261226">
     <w:abstractNumId w:val="2"/>
   </w:num>
-  <w:num w:numId="2" w16cid:durableId="1186290564">
+  <w:num w:numId="3" w16cid:durableId="900746879">
+    <w:abstractNumId w:val="0"/>
+  </w:num>
+  <w:num w:numId="4" w16cid:durableId="1060443929">
     <w:abstractNumId w:val="3"/>
   </w:num>
-  <w:num w:numId="3" w16cid:durableId="661128621">
-    <w:abstractNumId w:val="0"/>
+  <w:num w:numId="5" w16cid:durableId="409818524">
+    <w:abstractNumId w:val="6"/>
   </w:num>
-  <w:num w:numId="4" w16cid:durableId="1211500281">
+  <w:num w:numId="6" w16cid:durableId="1556501844">
+    <w:abstractNumId w:val="1"/>
+  </w:num>
+  <w:num w:numId="7" w16cid:durableId="1174108426">
     <w:abstractNumId w:val="4"/>
   </w:num>
-  <w:num w:numId="5" w16cid:durableId="1745952188">
-    <w:abstractNumId w:val="1"/>
+  <w:num w:numId="8" w16cid:durableId="607541736">
+    <w:abstractNumId w:val="5"/>
+  </w:num>
+  <w:num w:numId="9" w16cid:durableId="439185981">
+    <w:abstractNumId w:val="7"/>
   </w:num>
 </w:numbering>
 </file>
@@ -2464,7 +4953,7 @@
     <w:link w:val="Heading1Char"/>
     <w:uiPriority w:val="9"/>
     <w:qFormat/>
-    <w:rsid w:val="00261C7E"/>
+    <w:rsid w:val="00E46CE8"/>
     <w:pPr>
       <w:keepNext/>
       <w:keepLines/>
@@ -2487,7 +4976,7 @@
     <w:semiHidden/>
     <w:unhideWhenUsed/>
     <w:qFormat/>
-    <w:rsid w:val="00261C7E"/>
+    <w:rsid w:val="00E46CE8"/>
     <w:pPr>
       <w:keepNext/>
       <w:keepLines/>
@@ -2510,7 +4999,7 @@
     <w:semiHidden/>
     <w:unhideWhenUsed/>
     <w:qFormat/>
-    <w:rsid w:val="00261C7E"/>
+    <w:rsid w:val="00E46CE8"/>
     <w:pPr>
       <w:keepNext/>
       <w:keepLines/>
@@ -2533,7 +5022,7 @@
     <w:semiHidden/>
     <w:unhideWhenUsed/>
     <w:qFormat/>
-    <w:rsid w:val="00261C7E"/>
+    <w:rsid w:val="00E46CE8"/>
     <w:pPr>
       <w:keepNext/>
       <w:keepLines/>
@@ -2556,7 +5045,7 @@
     <w:semiHidden/>
     <w:unhideWhenUsed/>
     <w:qFormat/>
-    <w:rsid w:val="00261C7E"/>
+    <w:rsid w:val="00E46CE8"/>
     <w:pPr>
       <w:keepNext/>
       <w:keepLines/>
@@ -2577,7 +5066,7 @@
     <w:semiHidden/>
     <w:unhideWhenUsed/>
     <w:qFormat/>
-    <w:rsid w:val="00261C7E"/>
+    <w:rsid w:val="00E46CE8"/>
     <w:pPr>
       <w:keepNext/>
       <w:keepLines/>
@@ -2600,7 +5089,7 @@
     <w:semiHidden/>
     <w:unhideWhenUsed/>
     <w:qFormat/>
-    <w:rsid w:val="00261C7E"/>
+    <w:rsid w:val="00E46CE8"/>
     <w:pPr>
       <w:keepNext/>
       <w:keepLines/>
@@ -2621,7 +5110,7 @@
     <w:semiHidden/>
     <w:unhideWhenUsed/>
     <w:qFormat/>
-    <w:rsid w:val="00261C7E"/>
+    <w:rsid w:val="00E46CE8"/>
     <w:pPr>
       <w:keepNext/>
       <w:keepLines/>
@@ -2644,7 +5133,7 @@
     <w:semiHidden/>
     <w:unhideWhenUsed/>
     <w:qFormat/>
-    <w:rsid w:val="00261C7E"/>
+    <w:rsid w:val="00E46CE8"/>
     <w:pPr>
       <w:keepNext/>
       <w:keepLines/>
@@ -2659,6 +5148,7 @@
   <w:style w:type="character" w:default="1" w:styleId="DefaultParagraphFont">
     <w:name w:val="Default Paragraph Font"/>
     <w:uiPriority w:val="1"/>
+    <w:semiHidden/>
     <w:unhideWhenUsed/>
   </w:style>
   <w:style w:type="table" w:default="1" w:styleId="TableNormal">
@@ -2687,7 +5177,7 @@
     <w:basedOn w:val="DefaultParagraphFont"/>
     <w:link w:val="Heading1"/>
     <w:uiPriority w:val="9"/>
-    <w:rsid w:val="00261C7E"/>
+    <w:rsid w:val="00E46CE8"/>
     <w:rPr>
       <w:rFonts w:asciiTheme="majorHAnsi" w:eastAsiaTheme="majorEastAsia" w:hAnsiTheme="majorHAnsi" w:cstheme="majorBidi"/>
       <w:color w:val="2F5496" w:themeColor="accent1" w:themeShade="BF"/>
@@ -2701,7 +5191,7 @@
     <w:link w:val="Heading2"/>
     <w:uiPriority w:val="9"/>
     <w:semiHidden/>
-    <w:rsid w:val="00261C7E"/>
+    <w:rsid w:val="00E46CE8"/>
     <w:rPr>
       <w:rFonts w:asciiTheme="majorHAnsi" w:eastAsiaTheme="majorEastAsia" w:hAnsiTheme="majorHAnsi" w:cstheme="majorBidi"/>
       <w:color w:val="2F5496" w:themeColor="accent1" w:themeShade="BF"/>
@@ -2715,7 +5205,7 @@
     <w:link w:val="Heading3"/>
     <w:uiPriority w:val="9"/>
     <w:semiHidden/>
-    <w:rsid w:val="00261C7E"/>
+    <w:rsid w:val="00E46CE8"/>
     <w:rPr>
       <w:rFonts w:eastAsiaTheme="majorEastAsia" w:cstheme="majorBidi"/>
       <w:color w:val="2F5496" w:themeColor="accent1" w:themeShade="BF"/>
@@ -2729,7 +5219,7 @@
     <w:link w:val="Heading4"/>
     <w:uiPriority w:val="9"/>
     <w:semiHidden/>
-    <w:rsid w:val="00261C7E"/>
+    <w:rsid w:val="00E46CE8"/>
     <w:rPr>
       <w:rFonts w:eastAsiaTheme="majorEastAsia" w:cstheme="majorBidi"/>
       <w:i/>
@@ -2743,7 +5233,7 @@
     <w:link w:val="Heading5"/>
     <w:uiPriority w:val="9"/>
     <w:semiHidden/>
-    <w:rsid w:val="00261C7E"/>
+    <w:rsid w:val="00E46CE8"/>
     <w:rPr>
       <w:rFonts w:eastAsiaTheme="majorEastAsia" w:cstheme="majorBidi"/>
       <w:color w:val="2F5496" w:themeColor="accent1" w:themeShade="BF"/>
@@ -2755,7 +5245,7 @@
     <w:link w:val="Heading6"/>
     <w:uiPriority w:val="9"/>
     <w:semiHidden/>
-    <w:rsid w:val="00261C7E"/>
+    <w:rsid w:val="00E46CE8"/>
     <w:rPr>
       <w:rFonts w:eastAsiaTheme="majorEastAsia" w:cstheme="majorBidi"/>
       <w:i/>
@@ -2769,7 +5259,7 @@
     <w:link w:val="Heading7"/>
     <w:uiPriority w:val="9"/>
     <w:semiHidden/>
-    <w:rsid w:val="00261C7E"/>
+    <w:rsid w:val="00E46CE8"/>
     <w:rPr>
       <w:rFonts w:eastAsiaTheme="majorEastAsia" w:cstheme="majorBidi"/>
       <w:color w:val="595959" w:themeColor="text1" w:themeTint="A6"/>
@@ -2781,7 +5271,7 @@
     <w:link w:val="Heading8"/>
     <w:uiPriority w:val="9"/>
     <w:semiHidden/>
-    <w:rsid w:val="00261C7E"/>
+    <w:rsid w:val="00E46CE8"/>
     <w:rPr>
       <w:rFonts w:eastAsiaTheme="majorEastAsia" w:cstheme="majorBidi"/>
       <w:i/>
@@ -2795,7 +5285,7 @@
     <w:link w:val="Heading9"/>
     <w:uiPriority w:val="9"/>
     <w:semiHidden/>
-    <w:rsid w:val="00261C7E"/>
+    <w:rsid w:val="00E46CE8"/>
     <w:rPr>
       <w:rFonts w:eastAsiaTheme="majorEastAsia" w:cstheme="majorBidi"/>
       <w:color w:val="272727" w:themeColor="text1" w:themeTint="D8"/>
@@ -2808,7 +5298,7 @@
     <w:link w:val="TitleChar"/>
     <w:uiPriority w:val="10"/>
     <w:qFormat/>
-    <w:rsid w:val="00261C7E"/>
+    <w:rsid w:val="00E46CE8"/>
     <w:pPr>
       <w:spacing w:after="80" w:line="240" w:lineRule="auto"/>
       <w:contextualSpacing/>
@@ -2826,7 +5316,7 @@
     <w:basedOn w:val="DefaultParagraphFont"/>
     <w:link w:val="Title"/>
     <w:uiPriority w:val="10"/>
-    <w:rsid w:val="00261C7E"/>
+    <w:rsid w:val="00E46CE8"/>
     <w:rPr>
       <w:rFonts w:asciiTheme="majorHAnsi" w:eastAsiaTheme="majorEastAsia" w:hAnsiTheme="majorHAnsi" w:cstheme="majorBidi"/>
       <w:spacing w:val="-10"/>
@@ -2842,7 +5332,7 @@
     <w:link w:val="SubtitleChar"/>
     <w:uiPriority w:val="11"/>
     <w:qFormat/>
-    <w:rsid w:val="00261C7E"/>
+    <w:rsid w:val="00E46CE8"/>
     <w:pPr>
       <w:numPr>
         <w:ilvl w:val="1"/>
@@ -2861,7 +5351,7 @@
     <w:basedOn w:val="DefaultParagraphFont"/>
     <w:link w:val="Subtitle"/>
     <w:uiPriority w:val="11"/>
-    <w:rsid w:val="00261C7E"/>
+    <w:rsid w:val="00E46CE8"/>
     <w:rPr>
       <w:rFonts w:eastAsiaTheme="majorEastAsia" w:cstheme="majorBidi"/>
       <w:color w:val="595959" w:themeColor="text1" w:themeTint="A6"/>
@@ -2877,7 +5367,7 @@
     <w:link w:val="QuoteChar"/>
     <w:uiPriority w:val="29"/>
     <w:qFormat/>
-    <w:rsid w:val="00261C7E"/>
+    <w:rsid w:val="00E46CE8"/>
     <w:pPr>
       <w:spacing w:before="160"/>
       <w:jc w:val="center"/>
@@ -2893,7 +5383,7 @@
     <w:basedOn w:val="DefaultParagraphFont"/>
     <w:link w:val="Quote"/>
     <w:uiPriority w:val="29"/>
-    <w:rsid w:val="00261C7E"/>
+    <w:rsid w:val="00E46CE8"/>
     <w:rPr>
       <w:i/>
       <w:iCs/>
@@ -2905,7 +5395,7 @@
     <w:basedOn w:val="Normal"/>
     <w:uiPriority w:val="34"/>
     <w:qFormat/>
-    <w:rsid w:val="00261C7E"/>
+    <w:rsid w:val="00E46CE8"/>
     <w:pPr>
       <w:ind w:left="720"/>
       <w:contextualSpacing/>
@@ -2916,7 +5406,7 @@
     <w:basedOn w:val="DefaultParagraphFont"/>
     <w:uiPriority w:val="21"/>
     <w:qFormat/>
-    <w:rsid w:val="00261C7E"/>
+    <w:rsid w:val="00E46CE8"/>
     <w:rPr>
       <w:i/>
       <w:iCs/>
@@ -2930,7 +5420,7 @@
     <w:link w:val="IntenseQuoteChar"/>
     <w:uiPriority w:val="30"/>
     <w:qFormat/>
-    <w:rsid w:val="00261C7E"/>
+    <w:rsid w:val="00E46CE8"/>
     <w:pPr>
       <w:pBdr>
         <w:top w:val="single" w:sz="4" w:space="10" w:color="2F5496" w:themeColor="accent1" w:themeShade="BF"/>
@@ -2951,7 +5441,7 @@
     <w:basedOn w:val="DefaultParagraphFont"/>
     <w:link w:val="IntenseQuote"/>
     <w:uiPriority w:val="30"/>
-    <w:rsid w:val="00261C7E"/>
+    <w:rsid w:val="00E46CE8"/>
     <w:rPr>
       <w:i/>
       <w:iCs/>
@@ -2963,7 +5453,7 @@
     <w:basedOn w:val="DefaultParagraphFont"/>
     <w:uiPriority w:val="32"/>
     <w:qFormat/>
-    <w:rsid w:val="00261C7E"/>
+    <w:rsid w:val="00E46CE8"/>
     <w:rPr>
       <w:b/>
       <w:bCs/>
@@ -2971,6 +5461,25 @@
       <w:color w:val="2F5496" w:themeColor="accent1" w:themeShade="BF"/>
       <w:spacing w:val="5"/>
     </w:rPr>
+  </w:style>
+  <w:style w:type="table" w:styleId="TableGrid">
+    <w:name w:val="Table Grid"/>
+    <w:basedOn w:val="TableNormal"/>
+    <w:uiPriority w:val="39"/>
+    <w:rsid w:val="00F103A1"/>
+    <w:pPr>
+      <w:spacing w:after="0" w:line="240" w:lineRule="auto"/>
+    </w:pPr>
+    <w:tblPr>
+      <w:tblBorders>
+        <w:top w:val="single" w:sz="4" w:space="0" w:color="auto"/>
+        <w:left w:val="single" w:sz="4" w:space="0" w:color="auto"/>
+        <w:bottom w:val="single" w:sz="4" w:space="0" w:color="auto"/>
+        <w:right w:val="single" w:sz="4" w:space="0" w:color="auto"/>
+        <w:insideH w:val="single" w:sz="4" w:space="0" w:color="auto"/>
+        <w:insideV w:val="single" w:sz="4" w:space="0" w:color="auto"/>
+      </w:tblBorders>
+    </w:tblPr>
   </w:style>
 </w:styles>
 </file>

</xml_diff>